<commit_message>
Session du 30/09/2026 — Sprint H0 clôturé (6/6)
Livrables du 30/09/2026 :
- 13 migrations SQL (V1-V7 CP + V1-V7 Tenant)
- 7 migrations Flyway appliquées
- 6 ADRs (008 à 013)
- 9 fichiers Java (~455 lignes)
- 4 fichiers infra/ (Docker Compose, Makefile, scripts)
- 3 seeds + scripts db/
- Rapport journalier n°10 (Word + PDF + Markdown)

Infrastructure :
- PostgreSQL 16 + Redis 7 + Vault 1.17 + MinIO
- 4 services Docker healthy
- 12 partitions créées automatiquement

Sprint H0 : 6/6 points clôturés
Phase 1 : ~82 % d'avancement

Note : les captures d'écran sont exclues de ce commit.
Elles seront ajoutées dans un commit séparé si nécessaire.

Réf. : Rapports 04-78 à 10-78, ADR-001 à ADR-013, BACKLOG (H0)
</commit_message>
<xml_diff>
--- a/docs/rapports/export/Rapport_Journalier_n10_Yameogo_Idrissa.docx
+++ b/docs/rapports/export/Rapport_Journalier_n10_Yameogo_Idrissa.docx
@@ -1237,7 +1237,7 @@
     </w:p>
     <w:bookmarkEnd w:id="21"/>
     <w:bookmarkEnd w:id="22"/>
-    <w:bookmarkStart w:id="113" w:name="tâches-réalisées-et-leur-déroulement"/>
+    <w:bookmarkStart w:id="116" w:name="tâches-réalisées-et-leur-déroulement"/>
     <w:p>
       <w:pPr>
         <w:pStyle w:val="Heading2"/>
@@ -1687,7 +1687,7 @@
       </w:r>
     </w:p>
     <w:bookmarkEnd w:id="23"/>
-    <w:bookmarkStart w:id="44" w:name="Xb897b160a1e9df8a28041411326a7523064b457"/>
+    <w:bookmarkStart w:id="47" w:name="Xb897b160a1e9df8a28041411326a7523064b457"/>
     <w:p>
       <w:pPr>
         <w:pStyle w:val="Heading3"/>
@@ -2011,20 +2011,87 @@
       <w:r>
         <w:drawing>
           <wp:inline>
-            <wp:extent cx="5334000" cy="1866899"/>
+            <wp:extent cx="5334000" cy="2197985"/>
             <wp:effectExtent b="0" l="0" r="0" t="0"/>
-            <wp:docPr descr="Création de la sauvegarde horodatée db.backup-20260930-094319/." title="" id="30" name="Picture"/>
+            <wp:docPr descr="01 pgsty pull" title="" id="30" name="Picture"/>
             <a:graphic>
               <a:graphicData uri="http://schemas.openxmlformats.org/drawingml/2006/picture">
                 <pic:pic>
                   <pic:nvPicPr>
-                    <pic:cNvPr descr="/home/idrissa_yameogo/projets/ycognicore-cloud/docs/rapports/captures/10/03-sauvegarde.png" id="31" name="Picture"/>
+                    <pic:cNvPr descr="/home/idrissa_yameogo/projets/ycognicore-cloud/docs/rapports/captures/10/01-pgsty-pull.png" id="31" name="Picture"/>
                     <pic:cNvPicPr>
                       <a:picLocks noChangeArrowheads="1" noChangeAspect="1"/>
                     </pic:cNvPicPr>
                   </pic:nvPicPr>
                   <pic:blipFill>
                     <a:blip r:embed="rId29"/>
+                    <a:stretch>
+                      <a:fillRect/>
+                    </a:stretch>
+                  </pic:blipFill>
+                  <pic:spPr bwMode="auto">
+                    <a:xfrm>
+                      <a:off x="0" y="0"/>
+                      <a:ext cx="5334000" cy="2197985"/>
+                    </a:xfrm>
+                    <a:prstGeom prst="rect">
+                      <a:avLst/>
+                    </a:prstGeom>
+                    <a:noFill/>
+                    <a:ln w="9525">
+                      <a:noFill/>
+                      <a:headEnd/>
+                      <a:tailEnd/>
+                    </a:ln>
+                  </pic:spPr>
+                </pic:pic>
+              </a:graphicData>
+            </a:graphic>
+          </wp:inline>
+        </w:drawing>
+      </w:r>
+    </w:p>
+    <w:p>
+      <w:pPr>
+        <w:pStyle w:val="ImageCaption"/>
+      </w:pPr>
+      <w:r>
+        <w:t xml:space="preserve">01 pgsty pull</w:t>
+      </w:r>
+    </w:p>
+    <w:p>
+      <w:pPr>
+        <w:pStyle w:val="BodyText"/>
+      </w:pPr>
+      <w:r>
+        <w:rPr>
+          <w:i/>
+          <w:iCs/>
+        </w:rPr>
+        <w:t xml:space="preserve">01 pgsty pull</w:t>
+      </w:r>
+    </w:p>
+    <w:p>
+      <w:pPr>
+        <w:pStyle w:val="CaptionedFigure"/>
+      </w:pPr>
+      <w:r>
+        <w:drawing>
+          <wp:inline>
+            <wp:extent cx="5334000" cy="1866899"/>
+            <wp:effectExtent b="0" l="0" r="0" t="0"/>
+            <wp:docPr descr="Création de la sauvegarde horodatée db.backup-20260930-094319/." title="" id="33" name="Picture"/>
+            <a:graphic>
+              <a:graphicData uri="http://schemas.openxmlformats.org/drawingml/2006/picture">
+                <pic:pic>
+                  <pic:nvPicPr>
+                    <pic:cNvPr descr="/home/idrissa_yameogo/projets/ycognicore-cloud/docs/rapports/captures/10/03-sauvegarde.png" id="34" name="Picture"/>
+                    <pic:cNvPicPr>
+                      <a:picLocks noChangeArrowheads="1" noChangeAspect="1"/>
+                    </pic:cNvPicPr>
+                  </pic:nvPicPr>
+                  <pic:blipFill>
+                    <a:blip r:embed="rId32"/>
                     <a:stretch>
                       <a:fillRect/>
                     </a:stretch>
@@ -2080,18 +2147,18 @@
           <wp:inline>
             <wp:extent cx="5334000" cy="2844800"/>
             <wp:effectExtent b="0" l="0" r="0" t="0"/>
-            <wp:docPr descr="Arborescence initiale : 6 fichiers SQL (V1-V3 CP + V1-V3 Tenant)." title="" id="33" name="Picture"/>
+            <wp:docPr descr="Arborescence initiale : 6 fichiers SQL (V1-V3 CP + V1-V3 Tenant)." title="" id="36" name="Picture"/>
             <a:graphic>
               <a:graphicData uri="http://schemas.openxmlformats.org/drawingml/2006/picture">
                 <pic:pic>
                   <pic:nvPicPr>
-                    <pic:cNvPr descr="/home/idrissa_yameogo/projets/ycognicore-cloud/docs/rapports/captures/10/02-arborescence-initiale.png" id="34" name="Picture"/>
+                    <pic:cNvPr descr="/home/idrissa_yameogo/projets/ycognicore-cloud/docs/rapports/captures/10/02-arborescence-initiale.png" id="37" name="Picture"/>
                     <pic:cNvPicPr>
                       <a:picLocks noChangeArrowheads="1" noChangeAspect="1"/>
                     </pic:cNvPicPr>
                   </pic:nvPicPr>
                   <pic:blipFill>
-                    <a:blip r:embed="rId32"/>
+                    <a:blip r:embed="rId35"/>
                     <a:stretch>
                       <a:fillRect/>
                     </a:stretch>
@@ -2147,18 +2214,18 @@
           <wp:inline>
             <wp:extent cx="5334000" cy="1164311"/>
             <wp:effectExtent b="0" l="0" r="0" t="0"/>
-            <wp:docPr descr="État des conteneurs Docker au démarrage de la journée." title="" id="36" name="Picture"/>
+            <wp:docPr descr="État des conteneurs Docker au démarrage de la journée." title="" id="39" name="Picture"/>
             <a:graphic>
               <a:graphicData uri="http://schemas.openxmlformats.org/drawingml/2006/picture">
                 <pic:pic>
                   <pic:nvPicPr>
-                    <pic:cNvPr descr="/home/idrissa_yameogo/projets/ycognicore-cloud/docs/rapports/captures/10/01-docker-ps.png" id="37" name="Picture"/>
+                    <pic:cNvPr descr="/home/idrissa_yameogo/projets/ycognicore-cloud/docs/rapports/captures/10/01-docker-ps.png" id="40" name="Picture"/>
                     <pic:cNvPicPr>
                       <a:picLocks noChangeArrowheads="1" noChangeAspect="1"/>
                     </pic:cNvPicPr>
                   </pic:nvPicPr>
                   <pic:blipFill>
-                    <a:blip r:embed="rId35"/>
+                    <a:blip r:embed="rId38"/>
                     <a:stretch>
                       <a:fillRect/>
                     </a:stretch>
@@ -2232,18 +2299,18 @@
           <wp:inline>
             <wp:extent cx="5334000" cy="2400300"/>
             <wp:effectExtent b="0" l="0" r="0" t="0"/>
-            <wp:docPr descr="État final Git : historique des commits et tags de la journée." title="" id="39" name="Picture"/>
+            <wp:docPr descr="État final Git : historique des commits et tags de la journée." title="" id="42" name="Picture"/>
             <a:graphic>
               <a:graphicData uri="http://schemas.openxmlformats.org/drawingml/2006/picture">
                 <pic:pic>
                   <pic:nvPicPr>
-                    <pic:cNvPr descr="/home/idrissa_yameogo/projets/ycognicore-cloud/docs/rapports/captures/10/51-etat-final-git.png" id="40" name="Picture"/>
+                    <pic:cNvPr descr="/home/idrissa_yameogo/projets/ycognicore-cloud/docs/rapports/captures/10/51-etat-final-git.png" id="43" name="Picture"/>
                     <pic:cNvPicPr>
                       <a:picLocks noChangeArrowheads="1" noChangeAspect="1"/>
                     </pic:cNvPicPr>
                   </pic:nvPicPr>
                   <pic:blipFill>
-                    <a:blip r:embed="rId38"/>
+                    <a:blip r:embed="rId41"/>
                     <a:stretch>
                       <a:fillRect/>
                     </a:stretch>
@@ -2299,18 +2366,18 @@
           <wp:inline>
             <wp:extent cx="5334000" cy="2311400"/>
             <wp:effectExtent b="0" l="0" r="0" t="0"/>
-            <wp:docPr descr="Commit BL-004 : intégration Flyway + ADRs 008/009/010." title="" id="42" name="Picture"/>
+            <wp:docPr descr="Commit BL-004 : intégration Flyway + ADRs 008/009/010." title="" id="45" name="Picture"/>
             <a:graphic>
               <a:graphicData uri="http://schemas.openxmlformats.org/drawingml/2006/picture">
                 <pic:pic>
                   <pic:nvPicPr>
-                    <pic:cNvPr descr="/home/idrissa_yameogo/projets/ycognicore-cloud/docs/rapports/captures/10/49-commit-bl004.png" id="43" name="Picture"/>
+                    <pic:cNvPr descr="/home/idrissa_yameogo/projets/ycognicore-cloud/docs/rapports/captures/10/49-commit-bl004.png" id="46" name="Picture"/>
                     <pic:cNvPicPr>
                       <a:picLocks noChangeArrowheads="1" noChangeAspect="1"/>
                     </pic:cNvPicPr>
                   </pic:nvPicPr>
                   <pic:blipFill>
-                    <a:blip r:embed="rId41"/>
+                    <a:blip r:embed="rId44"/>
                     <a:stretch>
                       <a:fillRect/>
                     </a:stretch>
@@ -2364,8 +2431,8 @@
         </w:pict>
       </w:r>
     </w:p>
-    <w:bookmarkEnd w:id="44"/>
-    <w:bookmarkStart w:id="50" w:name="Xeaa754c95fae8af11526b220e4a3b82cfe7b57a"/>
+    <w:bookmarkEnd w:id="47"/>
+    <w:bookmarkStart w:id="53" w:name="Xeaa754c95fae8af11526b220e4a3b82cfe7b57a"/>
     <w:p>
       <w:pPr>
         <w:pStyle w:val="Heading3"/>
@@ -2551,18 +2618,18 @@
           <wp:inline>
             <wp:extent cx="5334000" cy="1454198"/>
             <wp:effectExtent b="0" l="0" r="0" t="0"/>
-            <wp:docPr descr="Compteurs par migration (CREATE TABLE, FUNCTION, TRIGGER, lignes)." title="" id="46" name="Picture"/>
+            <wp:docPr descr="Compteurs par migration (CREATE TABLE, FUNCTION, TRIGGER, lignes)." title="" id="49" name="Picture"/>
             <a:graphic>
               <a:graphicData uri="http://schemas.openxmlformats.org/drawingml/2006/picture">
                 <pic:pic>
                   <pic:nvPicPr>
-                    <pic:cNvPr descr="/home/idrissa_yameogo/projets/ycognicore-cloud/docs/rapports/captures/10/05-recap-migrations.png" id="47" name="Picture"/>
+                    <pic:cNvPr descr="/home/idrissa_yameogo/projets/ycognicore-cloud/docs/rapports/captures/10/05-recap-migrations.png" id="50" name="Picture"/>
                     <pic:cNvPicPr>
                       <a:picLocks noChangeArrowheads="1" noChangeAspect="1"/>
                     </pic:cNvPicPr>
                   </pic:nvPicPr>
                   <pic:blipFill>
-                    <a:blip r:embed="rId45"/>
+                    <a:blip r:embed="rId48"/>
                     <a:stretch>
                       <a:fillRect/>
                     </a:stretch>
@@ -2618,12 +2685,12 @@
           <wp:inline>
             <wp:extent cx="5334000" cy="1740568"/>
             <wp:effectExtent b="0" l="0" r="0" t="0"/>
-            <wp:docPr descr="13 migrations finales" title="" id="48" name="Picture"/>
+            <wp:docPr descr="13 migrations finales" title="" id="51" name="Picture"/>
             <a:graphic>
               <a:graphicData uri="http://schemas.openxmlformats.org/drawingml/2006/picture">
                 <pic:pic>
                   <pic:nvPicPr>
-                    <pic:cNvPr descr="/home/idrissa_yameogo/projets/ycognicore-cloud/docs/rapports/captures/10/04-13-migrations.png" id="49" name="Picture"/>
+                    <pic:cNvPr descr="/home/idrissa_yameogo/projets/ycognicore-cloud/docs/rapports/captures/10/04-13-migrations.png" id="52" name="Picture"/>
                     <pic:cNvPicPr>
                       <a:picLocks noChangeArrowheads="1" noChangeAspect="1"/>
                     </pic:cNvPicPr>
@@ -2701,8 +2768,8 @@
         </w:pict>
       </w:r>
     </w:p>
-    <w:bookmarkEnd w:id="50"/>
-    <w:bookmarkStart w:id="53" w:name="tâche-3-décisions-technologiques-bloc-2"/>
+    <w:bookmarkEnd w:id="53"/>
+    <w:bookmarkStart w:id="56" w:name="tâche-3-décisions-technologiques-bloc-2"/>
     <w:p>
       <w:pPr>
         <w:pStyle w:val="Heading3"/>
@@ -2720,7 +2787,7 @@
         <w:t xml:space="preserve">Tâche 3 — Décisions technologiques (BLOC 2)</w:t>
       </w:r>
     </w:p>
-    <w:bookmarkStart w:id="51" w:name="adr-008-choix-de-spring-boot-4"/>
+    <w:bookmarkStart w:id="54" w:name="adr-008-choix-de-spring-boot-4"/>
     <w:p>
       <w:pPr>
         <w:pStyle w:val="Heading4"/>
@@ -2829,8 +2896,8 @@
         <w:t xml:space="preserve">Support d’Hibernate 7 (multi-tenant natif — ADR-006)</w:t>
       </w:r>
     </w:p>
-    <w:bookmarkEnd w:id="51"/>
-    <w:bookmarkStart w:id="52" w:name="adr-009-choix-dangular-22-lts"/>
+    <w:bookmarkEnd w:id="54"/>
+    <w:bookmarkStart w:id="55" w:name="adr-009-choix-dangular-22-lts"/>
     <w:p>
       <w:pPr>
         <w:pStyle w:val="Heading4"/>
@@ -2961,9 +3028,9 @@
         </w:pict>
       </w:r>
     </w:p>
-    <w:bookmarkEnd w:id="52"/>
-    <w:bookmarkEnd w:id="53"/>
-    <w:bookmarkStart w:id="77" w:name="tâche-4-intégration-flyway-bloc-3-bl-004"/>
+    <w:bookmarkEnd w:id="55"/>
+    <w:bookmarkEnd w:id="56"/>
+    <w:bookmarkStart w:id="80" w:name="tâche-4-intégration-flyway-bloc-3-bl-004"/>
     <w:p>
       <w:pPr>
         <w:pStyle w:val="Heading3"/>
@@ -2999,7 +3066,7 @@
         <w:t xml:space="preserve">faire piloter le schéma Control Plane par Flyway.</w:t>
       </w:r>
     </w:p>
-    <w:bookmarkStart w:id="60" w:name="ajout-des-dépendances"/>
+    <w:bookmarkStart w:id="63" w:name="ajout-des-dépendances"/>
     <w:p>
       <w:pPr>
         <w:pStyle w:val="Heading4"/>
@@ -3076,18 +3143,18 @@
           <wp:inline>
             <wp:extent cx="5334000" cy="1333500"/>
             <wp:effectExtent b="0" l="0" r="0" t="0"/>
-            <wp:docPr descr="Indentation TAB" title="" id="55" name="Picture"/>
+            <wp:docPr descr="Indentation TAB" title="" id="58" name="Picture"/>
             <a:graphic>
               <a:graphicData uri="http://schemas.openxmlformats.org/drawingml/2006/picture">
                 <pic:pic>
                   <pic:nvPicPr>
-                    <pic:cNvPr descr="/home/idrissa_yameogo/projets/ycognicore-cloud/docs/rapports/captures/10/08-tab-detection.png" id="56" name="Picture"/>
+                    <pic:cNvPr descr="/home/idrissa_yameogo/projets/ycognicore-cloud/docs/rapports/captures/10/08-tab-detection.png" id="59" name="Picture"/>
                     <pic:cNvPicPr>
                       <a:picLocks noChangeArrowheads="1" noChangeAspect="1"/>
                     </pic:cNvPicPr>
                   </pic:nvPicPr>
                   <pic:blipFill>
-                    <a:blip r:embed="rId54"/>
+                    <a:blip r:embed="rId57"/>
                     <a:stretch>
                       <a:fillRect/>
                     </a:stretch>
@@ -3143,18 +3210,18 @@
           <wp:inline>
             <wp:extent cx="5334000" cy="1866899"/>
             <wp:effectExtent b="0" l="0" r="0" t="0"/>
-            <wp:docPr descr="Dépendances pom.xml" title="" id="58" name="Picture"/>
+            <wp:docPr descr="Dépendances pom.xml" title="" id="61" name="Picture"/>
             <a:graphic>
               <a:graphicData uri="http://schemas.openxmlformats.org/drawingml/2006/picture">
                 <pic:pic>
                   <pic:nvPicPr>
-                    <pic:cNvPr descr="/home/idrissa_yameogo/projets/ycognicore-cloud/docs/rapports/captures/10/09-flyway-pom.png" id="59" name="Picture"/>
+                    <pic:cNvPr descr="/home/idrissa_yameogo/projets/ycognicore-cloud/docs/rapports/captures/10/09-flyway-pom.png" id="62" name="Picture"/>
                     <pic:cNvPicPr>
                       <a:picLocks noChangeArrowheads="1" noChangeAspect="1"/>
                     </pic:cNvPicPr>
                   </pic:nvPicPr>
                   <pic:blipFill>
-                    <a:blip r:embed="rId57"/>
+                    <a:blip r:embed="rId60"/>
                     <a:stretch>
                       <a:fillRect/>
                     </a:stretch>
@@ -3201,8 +3268,8 @@
         <w:t xml:space="preserve">Figure 5 — Ajout des dépendances Flyway + vérification visuelle.</w:t>
       </w:r>
     </w:p>
-    <w:bookmarkEnd w:id="60"/>
-    <w:bookmarkStart w:id="64" w:name="validation-et-compilation"/>
+    <w:bookmarkEnd w:id="63"/>
+    <w:bookmarkStart w:id="67" w:name="validation-et-compilation"/>
     <w:p>
       <w:pPr>
         <w:pStyle w:val="Heading4"/>
@@ -3229,18 +3296,18 @@
           <wp:inline>
             <wp:extent cx="5334000" cy="1333500"/>
             <wp:effectExtent b="0" l="0" r="0" t="0"/>
-            <wp:docPr descr="Validation OK" title="" id="62" name="Picture"/>
+            <wp:docPr descr="Validation OK" title="" id="65" name="Picture"/>
             <a:graphic>
               <a:graphicData uri="http://schemas.openxmlformats.org/drawingml/2006/picture">
                 <pic:pic>
                   <pic:nvPicPr>
-                    <pic:cNvPr descr="/home/idrissa_yameogo/projets/ycognicore-cloud/docs/rapports/captures/10/10-validation-compilation.png" id="63" name="Picture"/>
+                    <pic:cNvPr descr="/home/idrissa_yameogo/projets/ycognicore-cloud/docs/rapports/captures/10/10-validation-compilation.png" id="66" name="Picture"/>
                     <pic:cNvPicPr>
                       <a:picLocks noChangeArrowheads="1" noChangeAspect="1"/>
                     </pic:cNvPicPr>
                   </pic:nvPicPr>
                   <pic:blipFill>
-                    <a:blip r:embed="rId61"/>
+                    <a:blip r:embed="rId64"/>
                     <a:stretch>
                       <a:fillRect/>
                     </a:stretch>
@@ -3287,8 +3354,8 @@
         <w:t xml:space="preserve">Figure 6 — XML valide + compilation OK.</w:t>
       </w:r>
     </w:p>
-    <w:bookmarkEnd w:id="64"/>
-    <w:bookmarkStart w:id="68" w:name="configuration-application.yml"/>
+    <w:bookmarkEnd w:id="67"/>
+    <w:bookmarkStart w:id="71" w:name="configuration-application.yml"/>
     <w:p>
       <w:pPr>
         <w:pStyle w:val="Heading4"/>
@@ -3315,18 +3382,18 @@
           <wp:inline>
             <wp:extent cx="5334000" cy="4533900"/>
             <wp:effectExtent b="0" l="0" r="0" t="0"/>
-            <wp:docPr descr="application.yml" title="" id="66" name="Picture"/>
+            <wp:docPr descr="application.yml" title="" id="69" name="Picture"/>
             <a:graphic>
               <a:graphicData uri="http://schemas.openxmlformats.org/drawingml/2006/picture">
                 <pic:pic>
                   <pic:nvPicPr>
-                    <pic:cNvPr descr="/home/idrissa_yameogo/projets/ycognicore-cloud/docs/rapports/captures/10/11-application-yml.png" id="67" name="Picture"/>
+                    <pic:cNvPr descr="/home/idrissa_yameogo/projets/ycognicore-cloud/docs/rapports/captures/10/11-application-yml.png" id="70" name="Picture"/>
                     <pic:cNvPicPr>
                       <a:picLocks noChangeArrowheads="1" noChangeAspect="1"/>
                     </pic:cNvPicPr>
                   </pic:nvPicPr>
                   <pic:blipFill>
-                    <a:blip r:embed="rId65"/>
+                    <a:blip r:embed="rId68"/>
                     <a:stretch>
                       <a:fillRect/>
                     </a:stretch>
@@ -3373,8 +3440,8 @@
         <w:t xml:space="preserve">Figure 7 — application.yml créé (49 lignes).</w:t>
       </w:r>
     </w:p>
-    <w:bookmarkEnd w:id="68"/>
-    <w:bookmarkStart w:id="72" w:name="X95d9e40fc665da7fd7856f0428a762436f5d3db"/>
+    <w:bookmarkEnd w:id="71"/>
+    <w:bookmarkStart w:id="75" w:name="X95d9e40fc665da7fd7856f0428a762436f5d3db"/>
     <w:p>
       <w:pPr>
         <w:pStyle w:val="Heading4"/>
@@ -3401,18 +3468,18 @@
           <wp:inline>
             <wp:extent cx="5334000" cy="2576811"/>
             <wp:effectExtent b="0" l="0" r="0" t="0"/>
-            <wp:docPr descr="Starters Boot 4" title="" id="70" name="Picture"/>
+            <wp:docPr descr="Starters Boot 4" title="" id="73" name="Picture"/>
             <a:graphic>
               <a:graphicData uri="http://schemas.openxmlformats.org/drawingml/2006/picture">
                 <pic:pic>
                   <pic:nvPicPr>
-                    <pic:cNvPr descr="/home/idrissa_yameogo/projets/ycognicore-cloud/docs/rapports/captures/10/16-boot4-starters.png" id="71" name="Picture"/>
+                    <pic:cNvPr descr="/home/idrissa_yameogo/projets/ycognicore-cloud/docs/rapports/captures/10/16-boot4-starters.png" id="74" name="Picture"/>
                     <pic:cNvPicPr>
                       <a:picLocks noChangeArrowheads="1" noChangeAspect="1"/>
                     </pic:cNvPicPr>
                   </pic:nvPicPr>
                   <pic:blipFill>
-                    <a:blip r:embed="rId69"/>
+                    <a:blip r:embed="rId72"/>
                     <a:stretch>
                       <a:fillRect/>
                     </a:stretch>
@@ -3459,8 +3526,8 @@
         <w:t xml:space="preserve">Figure 8 — Diagnostic : aucun starter Flyway n’existe pour Boot 4.</w:t>
       </w:r>
     </w:p>
-    <w:bookmarkEnd w:id="72"/>
-    <w:bookmarkStart w:id="76" w:name="résultat-6-puis-7-migrations-appliquées"/>
+    <w:bookmarkEnd w:id="75"/>
+    <w:bookmarkStart w:id="79" w:name="résultat-6-puis-7-migrations-appliquées"/>
     <w:p>
       <w:pPr>
         <w:pStyle w:val="Heading4"/>
@@ -3487,18 +3554,18 @@
           <wp:inline>
             <wp:extent cx="5334000" cy="1331986"/>
             <wp:effectExtent b="0" l="0" r="0" t="0"/>
-            <wp:docPr descr="Flyway history" title="" id="74" name="Picture"/>
+            <wp:docPr descr="Flyway history" title="" id="77" name="Picture"/>
             <a:graphic>
               <a:graphicData uri="http://schemas.openxmlformats.org/drawingml/2006/picture">
                 <pic:pic>
                   <pic:nvPicPr>
-                    <pic:cNvPr descr="/home/idrissa_yameogo/projets/ycognicore-cloud/docs/rapports/captures/10/19-flyway-history.png" id="75" name="Picture"/>
+                    <pic:cNvPr descr="/home/idrissa_yameogo/projets/ycognicore-cloud/docs/rapports/captures/10/19-flyway-history.png" id="78" name="Picture"/>
                     <pic:cNvPicPr>
                       <a:picLocks noChangeArrowheads="1" noChangeAspect="1"/>
                     </pic:cNvPicPr>
                   </pic:nvPicPr>
                   <pic:blipFill>
-                    <a:blip r:embed="rId73"/>
+                    <a:blip r:embed="rId76"/>
                     <a:stretch>
                       <a:fillRect/>
                     </a:stretch>
@@ -3570,9 +3637,9 @@
         </w:pict>
       </w:r>
     </w:p>
-    <w:bookmarkEnd w:id="76"/>
-    <w:bookmarkEnd w:id="77"/>
-    <w:bookmarkStart w:id="94" w:name="X9413cbdb2b853f865b13181a204bdc1cb34990b"/>
+    <w:bookmarkEnd w:id="79"/>
+    <w:bookmarkEnd w:id="80"/>
+    <w:bookmarkStart w:id="97" w:name="X9413cbdb2b853f865b13181a204bdc1cb34990b"/>
     <w:p>
       <w:pPr>
         <w:pStyle w:val="Heading3"/>
@@ -3608,7 +3675,7 @@
         <w:t xml:space="preserve">automatiser la création des partitions mensuelles.</w:t>
       </w:r>
     </w:p>
-    <w:bookmarkStart w:id="81" w:name="création-de-la-migration-v7"/>
+    <w:bookmarkStart w:id="84" w:name="création-de-la-migration-v7"/>
     <w:p>
       <w:pPr>
         <w:pStyle w:val="Heading4"/>
@@ -3658,18 +3725,18 @@
           <wp:inline>
             <wp:extent cx="5334000" cy="2014482"/>
             <wp:effectExtent b="0" l="0" r="0" t="0"/>
-            <wp:docPr descr="V7 créé" title="" id="79" name="Picture"/>
+            <wp:docPr descr="V7 créé" title="" id="82" name="Picture"/>
             <a:graphic>
               <a:graphicData uri="http://schemas.openxmlformats.org/drawingml/2006/picture">
                 <pic:pic>
                   <pic:nvPicPr>
-                    <pic:cNvPr descr="/home/idrissa_yameogo/projets/ycognicore-cloud/docs/rapports/captures/10/23-v7-created.png" id="80" name="Picture"/>
+                    <pic:cNvPr descr="/home/idrissa_yameogo/projets/ycognicore-cloud/docs/rapports/captures/10/23-v7-created.png" id="83" name="Picture"/>
                     <pic:cNvPicPr>
                       <a:picLocks noChangeArrowheads="1" noChangeAspect="1"/>
                     </pic:cNvPicPr>
                   </pic:nvPicPr>
                   <pic:blipFill>
-                    <a:blip r:embed="rId78"/>
+                    <a:blip r:embed="rId81"/>
                     <a:stretch>
                       <a:fillRect/>
                     </a:stretch>
@@ -3712,8 +3779,8 @@
         <w:t xml:space="preserve">*Figure 10 — V7__add_partition_maintenance.sql créé.*</w:t>
       </w:r>
     </w:p>
-    <w:bookmarkEnd w:id="81"/>
-    <w:bookmarkStart w:id="85" w:name="succès-12-partitions-créées"/>
+    <w:bookmarkEnd w:id="84"/>
+    <w:bookmarkStart w:id="88" w:name="succès-12-partitions-créées"/>
     <w:p>
       <w:pPr>
         <w:pStyle w:val="Heading4"/>
@@ -3740,18 +3807,18 @@
           <wp:inline>
             <wp:extent cx="5334000" cy="1231515"/>
             <wp:effectExtent b="0" l="0" r="0" t="0"/>
-            <wp:docPr descr="Endpoint success" title="" id="83" name="Picture"/>
+            <wp:docPr descr="Endpoint success" title="" id="86" name="Picture"/>
             <a:graphic>
               <a:graphicData uri="http://schemas.openxmlformats.org/drawingml/2006/picture">
                 <pic:pic>
                   <pic:nvPicPr>
-                    <pic:cNvPr descr="/home/idrissa_yameogo/projets/ycognicore-cloud/docs/rapports/captures/10/30-endpoint-success.png" id="84" name="Picture"/>
+                    <pic:cNvPr descr="/home/idrissa_yameogo/projets/ycognicore-cloud/docs/rapports/captures/10/30-endpoint-success.png" id="87" name="Picture"/>
                     <pic:cNvPicPr>
                       <a:picLocks noChangeArrowheads="1" noChangeAspect="1"/>
                     </pic:cNvPicPr>
                   </pic:nvPicPr>
                   <pic:blipFill>
-                    <a:blip r:embed="rId82"/>
+                    <a:blip r:embed="rId85"/>
                     <a:stretch>
                       <a:fillRect/>
                     </a:stretch>
@@ -3821,8 +3888,8 @@
         <w:t xml:space="preserve">.</w:t>
       </w:r>
     </w:p>
-    <w:bookmarkEnd w:id="85"/>
-    <w:bookmarkStart w:id="89" w:name="vérification-en-base"/>
+    <w:bookmarkEnd w:id="88"/>
+    <w:bookmarkStart w:id="92" w:name="vérification-en-base"/>
     <w:p>
       <w:pPr>
         <w:pStyle w:val="Heading4"/>
@@ -3849,18 +3916,18 @@
           <wp:inline>
             <wp:extent cx="5334000" cy="2572668"/>
             <wp:effectExtent b="0" l="0" r="0" t="0"/>
-            <wp:docPr descr="Partitions demo001" title="" id="87" name="Picture"/>
+            <wp:docPr descr="Partitions demo001" title="" id="90" name="Picture"/>
             <a:graphic>
               <a:graphicData uri="http://schemas.openxmlformats.org/drawingml/2006/picture">
                 <pic:pic>
                   <pic:nvPicPr>
-                    <pic:cNvPr descr="/home/idrissa_yameogo/projets/ycognicore-cloud/docs/rapports/captures/10/31-partitions-demo001.png" id="88" name="Picture"/>
+                    <pic:cNvPr descr="/home/idrissa_yameogo/projets/ycognicore-cloud/docs/rapports/captures/10/31-partitions-demo001.png" id="91" name="Picture"/>
                     <pic:cNvPicPr>
                       <a:picLocks noChangeArrowheads="1" noChangeAspect="1"/>
                     </pic:cNvPicPr>
                   </pic:nvPicPr>
                   <pic:blipFill>
-                    <a:blip r:embed="rId86"/>
+                    <a:blip r:embed="rId89"/>
                     <a:stretch>
                       <a:fillRect/>
                     </a:stretch>
@@ -3907,8 +3974,8 @@
         <w:t xml:space="preserve">Figure 12 — demo001 : 30 objets (3 audit_log + 3 login_attempts + index hérités).</w:t>
       </w:r>
     </w:p>
-    <w:bookmarkEnd w:id="89"/>
-    <w:bookmarkStart w:id="93" w:name="journal-de-traçabilité"/>
+    <w:bookmarkEnd w:id="92"/>
+    <w:bookmarkStart w:id="96" w:name="journal-de-traçabilité"/>
     <w:p>
       <w:pPr>
         <w:pStyle w:val="Heading4"/>
@@ -3935,18 +4002,18 @@
           <wp:inline>
             <wp:extent cx="5334000" cy="1126434"/>
             <wp:effectExtent b="0" l="0" r="0" t="0"/>
-            <wp:docPr descr="Journal CP" title="" id="91" name="Picture"/>
+            <wp:docPr descr="Journal CP" title="" id="94" name="Picture"/>
             <a:graphic>
               <a:graphicData uri="http://schemas.openxmlformats.org/drawingml/2006/picture">
                 <pic:pic>
                   <pic:nvPicPr>
-                    <pic:cNvPr descr="/home/idrissa_yameogo/projets/ycognicore-cloud/docs/rapports/captures/10/33-journal-cp.png" id="92" name="Picture"/>
+                    <pic:cNvPr descr="/home/idrissa_yameogo/projets/ycognicore-cloud/docs/rapports/captures/10/33-journal-cp.png" id="95" name="Picture"/>
                     <pic:cNvPicPr>
                       <a:picLocks noChangeArrowheads="1" noChangeAspect="1"/>
                     </pic:cNvPicPr>
                   </pic:nvPicPr>
                   <pic:blipFill>
-                    <a:blip r:embed="rId90"/>
+                    <a:blip r:embed="rId93"/>
                     <a:stretch>
                       <a:fillRect/>
                     </a:stretch>
@@ -4018,9 +4085,9 @@
         </w:pict>
       </w:r>
     </w:p>
-    <w:bookmarkEnd w:id="93"/>
-    <w:bookmarkEnd w:id="94"/>
-    <w:bookmarkStart w:id="111" w:name="Xc5e749f703e9ed7cf8ab9c8eacceb0ab3cee905"/>
+    <w:bookmarkEnd w:id="96"/>
+    <w:bookmarkEnd w:id="97"/>
+    <w:bookmarkStart w:id="114" w:name="Xc5e749f703e9ed7cf8ab9c8eacceb0ab3cee905"/>
     <w:p>
       <w:pPr>
         <w:pStyle w:val="Heading3"/>
@@ -4056,7 +4123,7 @@
         <w:t xml:space="preserve">provisionner 4 services sans perte de données.</w:t>
       </w:r>
     </w:p>
-    <w:bookmarkStart w:id="98" w:name="analyse-des-volumes-et-ports"/>
+    <w:bookmarkStart w:id="101" w:name="analyse-des-volumes-et-ports"/>
     <w:p>
       <w:pPr>
         <w:pStyle w:val="Heading4"/>
@@ -4083,18 +4150,18 @@
           <wp:inline>
             <wp:extent cx="5334000" cy="1333500"/>
             <wp:effectExtent b="0" l="0" r="0" t="0"/>
-            <wp:docPr descr="Volumes Docker" title="" id="96" name="Picture"/>
+            <wp:docPr descr="Volumes Docker" title="" id="99" name="Picture"/>
             <a:graphic>
               <a:graphicData uri="http://schemas.openxmlformats.org/drawingml/2006/picture">
                 <pic:pic>
                   <pic:nvPicPr>
-                    <pic:cNvPr descr="/home/idrissa_yameogo/projets/ycognicore-cloud/docs/rapports/captures/10/35-volumes.png" id="97" name="Picture"/>
+                    <pic:cNvPr descr="/home/idrissa_yameogo/projets/ycognicore-cloud/docs/rapports/captures/10/35-volumes.png" id="100" name="Picture"/>
                     <pic:cNvPicPr>
                       <a:picLocks noChangeArrowheads="1" noChangeAspect="1"/>
                     </pic:cNvPicPr>
                   </pic:nvPicPr>
                   <pic:blipFill>
-                    <a:blip r:embed="rId95"/>
+                    <a:blip r:embed="rId98"/>
                     <a:stretch>
                       <a:fillRect/>
                     </a:stretch>
@@ -4170,8 +4237,8 @@
         <w:t xml:space="preserve">(85 Mo) identifié pour réutilisation.</w:t>
       </w:r>
     </w:p>
-    <w:bookmarkEnd w:id="98"/>
-    <w:bookmarkStart w:id="102" w:name="fichiers-dinfrastructure-validation"/>
+    <w:bookmarkEnd w:id="101"/>
+    <w:bookmarkStart w:id="105" w:name="fichiers-dinfrastructure-validation"/>
     <w:p>
       <w:pPr>
         <w:pStyle w:val="Heading4"/>
@@ -4198,18 +4265,18 @@
           <wp:inline>
             <wp:extent cx="5334000" cy="2435208"/>
             <wp:effectExtent b="0" l="0" r="0" t="0"/>
-            <wp:docPr descr="Validation YAML" title="" id="100" name="Picture"/>
+            <wp:docPr descr="Validation YAML" title="" id="103" name="Picture"/>
             <a:graphic>
               <a:graphicData uri="http://schemas.openxmlformats.org/drawingml/2006/picture">
                 <pic:pic>
                   <pic:nvPicPr>
-                    <pic:cNvPr descr="/home/idrissa_yameogo/projets/ycognicore-cloud/docs/rapports/captures/10/38-validation-yaml.png" id="101" name="Picture"/>
+                    <pic:cNvPr descr="/home/idrissa_yameogo/projets/ycognicore-cloud/docs/rapports/captures/10/38-validation-yaml.png" id="104" name="Picture"/>
                     <pic:cNvPicPr>
                       <a:picLocks noChangeArrowheads="1" noChangeAspect="1"/>
                     </pic:cNvPicPr>
                   </pic:nvPicPr>
                   <pic:blipFill>
-                    <a:blip r:embed="rId99"/>
+                    <a:blip r:embed="rId102"/>
                     <a:stretch>
                       <a:fillRect/>
                     </a:stretch>
@@ -4256,8 +4323,8 @@
         <w:t xml:space="preserve">Figure 15 — YAML docker-compose validé.</w:t>
       </w:r>
     </w:p>
-    <w:bookmarkEnd w:id="102"/>
-    <w:bookmarkStart w:id="106" w:name="démarrage-de-la-stack"/>
+    <w:bookmarkEnd w:id="105"/>
+    <w:bookmarkStart w:id="109" w:name="démarrage-de-la-stack"/>
     <w:p>
       <w:pPr>
         <w:pStyle w:val="Heading4"/>
@@ -4284,18 +4351,18 @@
           <wp:inline>
             <wp:extent cx="5334000" cy="1422400"/>
             <wp:effectExtent b="0" l="0" r="0" t="0"/>
-            <wp:docPr descr="Docker compose up" title="" id="104" name="Picture"/>
+            <wp:docPr descr="Docker compose up" title="" id="107" name="Picture"/>
             <a:graphic>
               <a:graphicData uri="http://schemas.openxmlformats.org/drawingml/2006/picture">
                 <pic:pic>
                   <pic:nvPicPr>
-                    <pic:cNvPr descr="/home/idrissa_yameogo/projets/ycognicore-cloud/docs/rapports/captures/10/41-docker-up.png" id="105" name="Picture"/>
+                    <pic:cNvPr descr="/home/idrissa_yameogo/projets/ycognicore-cloud/docs/rapports/captures/10/41-docker-up.png" id="108" name="Picture"/>
                     <pic:cNvPicPr>
                       <a:picLocks noChangeArrowheads="1" noChangeAspect="1"/>
                     </pic:cNvPicPr>
                   </pic:nvPicPr>
                   <pic:blipFill>
-                    <a:blip r:embed="rId103"/>
+                    <a:blip r:embed="rId106"/>
                     <a:stretch>
                       <a:fillRect/>
                     </a:stretch>
@@ -4342,8 +4409,8 @@
         <w:t xml:space="preserve">Figure 16 — Démarrage : 4 services, 1 réseau, 3 volumes.</w:t>
       </w:r>
     </w:p>
-    <w:bookmarkEnd w:id="106"/>
-    <w:bookmarkStart w:id="110" w:name="récapitulatif-infrastructure"/>
+    <w:bookmarkEnd w:id="109"/>
+    <w:bookmarkStart w:id="113" w:name="récapitulatif-infrastructure"/>
     <w:p>
       <w:pPr>
         <w:pStyle w:val="Heading4"/>
@@ -4370,18 +4437,18 @@
           <wp:inline>
             <wp:extent cx="5334000" cy="1515978"/>
             <wp:effectExtent b="0" l="0" r="0" t="0"/>
-            <wp:docPr descr="Récapitulatif BL-006" title="" id="108" name="Picture"/>
+            <wp:docPr descr="Récapitulatif BL-006" title="" id="111" name="Picture"/>
             <a:graphic>
               <a:graphicData uri="http://schemas.openxmlformats.org/drawingml/2006/picture">
                 <pic:pic>
                   <pic:nvPicPr>
-                    <pic:cNvPr descr="/home/idrissa_yameogo/projets/ycognicore-cloud/docs/rapports/captures/10/48-recap-bl006.png" id="109" name="Picture"/>
+                    <pic:cNvPr descr="/home/idrissa_yameogo/projets/ycognicore-cloud/docs/rapports/captures/10/48-recap-bl006.png" id="112" name="Picture"/>
                     <pic:cNvPicPr>
                       <a:picLocks noChangeArrowheads="1" noChangeAspect="1"/>
                     </pic:cNvPicPr>
                   </pic:nvPicPr>
                   <pic:blipFill>
-                    <a:blip r:embed="rId107"/>
+                    <a:blip r:embed="rId110"/>
                     <a:stretch>
                       <a:fillRect/>
                     </a:stretch>
@@ -4453,9 +4520,9 @@
         </w:pict>
       </w:r>
     </w:p>
-    <w:bookmarkEnd w:id="110"/>
-    <w:bookmarkEnd w:id="111"/>
-    <w:bookmarkStart w:id="112" w:name="tâche-7-nettoyage-et-clôture-bloc-6"/>
+    <w:bookmarkEnd w:id="113"/>
+    <w:bookmarkEnd w:id="114"/>
+    <w:bookmarkStart w:id="115" w:name="tâche-7-nettoyage-et-clôture-bloc-6"/>
     <w:p>
       <w:pPr>
         <w:pStyle w:val="Heading3"/>
@@ -4764,9 +4831,9 @@
         </w:pict>
       </w:r>
     </w:p>
-    <w:bookmarkEnd w:id="112"/>
-    <w:bookmarkEnd w:id="113"/>
-    <w:bookmarkStart w:id="140" w:name="X4f2a54e9354a1e15ffae15d13fd6e327816f6d0"/>
+    <w:bookmarkEnd w:id="115"/>
+    <w:bookmarkEnd w:id="116"/>
+    <w:bookmarkStart w:id="143" w:name="X4f2a54e9354a1e15ffae15d13fd6e327816f6d0"/>
     <w:p>
       <w:pPr>
         <w:pStyle w:val="Heading2"/>
@@ -4784,7 +4851,7 @@
         <w:t xml:space="preserve">3. Fonctionnalités développées, modifiées, corrigées ou testées</w:t>
       </w:r>
     </w:p>
-    <w:bookmarkStart w:id="119" w:name="fonctionnalités-développées-nouvelles"/>
+    <w:bookmarkStart w:id="122" w:name="fonctionnalités-développées-nouvelles"/>
     <w:p>
       <w:pPr>
         <w:pStyle w:val="Heading3"/>
@@ -4802,7 +4869,7 @@
         <w:t xml:space="preserve">3.1. Fonctionnalités développées (nouvelles)</w:t>
       </w:r>
     </w:p>
-    <w:bookmarkStart w:id="114" w:name="X028e8eda70314ce78d9230db8492acee229f0f1"/>
+    <w:bookmarkStart w:id="117" w:name="X028e8eda70314ce78d9230db8492acee229f0f1"/>
     <w:p>
       <w:pPr>
         <w:pStyle w:val="Heading4"/>
@@ -4988,8 +5055,8 @@
         <w:t xml:space="preserve">(2 endpoints)</w:t>
       </w:r>
     </w:p>
-    <w:bookmarkEnd w:id="114"/>
-    <w:bookmarkStart w:id="115" w:name="f-02-configuration-flyway-explicite"/>
+    <w:bookmarkEnd w:id="117"/>
+    <w:bookmarkStart w:id="118" w:name="f-02-configuration-flyway-explicite"/>
     <w:p>
       <w:pPr>
         <w:pStyle w:val="Heading4"/>
@@ -5034,8 +5101,8 @@
         <w:t xml:space="preserve">(~60 lignes).</w:t>
       </w:r>
     </w:p>
-    <w:bookmarkEnd w:id="115"/>
-    <w:bookmarkStart w:id="116" w:name="Xa6b5334b6a270291bc36cf756e9a208947cad56"/>
+    <w:bookmarkEnd w:id="118"/>
+    <w:bookmarkStart w:id="119" w:name="Xa6b5334b6a270291bc36cf756e9a208947cad56"/>
     <w:p>
       <w:pPr>
         <w:pStyle w:val="Heading4"/>
@@ -5080,8 +5147,8 @@
         <w:t xml:space="preserve">(~40 lignes).</w:t>
       </w:r>
     </w:p>
-    <w:bookmarkEnd w:id="116"/>
-    <w:bookmarkStart w:id="117" w:name="f-04-infrastructure-docker-complète"/>
+    <w:bookmarkEnd w:id="119"/>
+    <w:bookmarkStart w:id="120" w:name="f-04-infrastructure-docker-complète"/>
     <w:p>
       <w:pPr>
         <w:pStyle w:val="Heading4"/>
@@ -5159,8 +5226,8 @@
         <w:t xml:space="preserve">.</w:t>
       </w:r>
     </w:p>
-    <w:bookmarkEnd w:id="117"/>
-    <w:bookmarkStart w:id="118" w:name="f-05-activation-du-scheduling-spring"/>
+    <w:bookmarkEnd w:id="120"/>
+    <w:bookmarkStart w:id="121" w:name="f-05-activation-du-scheduling-spring"/>
     <w:p>
       <w:pPr>
         <w:pStyle w:val="Heading4"/>
@@ -5211,9 +5278,9 @@
         <w:t xml:space="preserve">).</w:t>
       </w:r>
     </w:p>
-    <w:bookmarkEnd w:id="118"/>
-    <w:bookmarkEnd w:id="119"/>
-    <w:bookmarkStart w:id="120" w:name="fonctionnalités-modifiées"/>
+    <w:bookmarkEnd w:id="121"/>
+    <w:bookmarkEnd w:id="122"/>
+    <w:bookmarkStart w:id="123" w:name="fonctionnalités-modifiées"/>
     <w:p>
       <w:pPr>
         <w:pStyle w:val="Heading3"/>
@@ -5495,8 +5562,8 @@
         </w:tc>
       </w:tr>
     </w:tbl>
-    <w:bookmarkEnd w:id="120"/>
-    <w:bookmarkStart w:id="139" w:name="fonctionnalités-testées"/>
+    <w:bookmarkEnd w:id="123"/>
+    <w:bookmarkStart w:id="142" w:name="fonctionnalités-testées"/>
     <w:p>
       <w:pPr>
         <w:pStyle w:val="Heading3"/>
@@ -5786,18 +5853,18 @@
           <wp:inline>
             <wp:extent cx="5334000" cy="1298995"/>
             <wp:effectExtent b="0" l="0" r="0" t="0"/>
-            <wp:docPr descr="Test 12 Tenant : NOTICE OK — password_history append-only." title="" id="122" name="Picture"/>
+            <wp:docPr descr="Test 12 Tenant : NOTICE OK — password_history append-only." title="" id="125" name="Picture"/>
             <a:graphic>
               <a:graphicData uri="http://schemas.openxmlformats.org/drawingml/2006/picture">
                 <pic:pic>
                   <pic:nvPicPr>
-                    <pic:cNvPr descr="/home/idrissa_yameogo/projets/ycognicore-cloud/docs/rapports/captures/10/61-test12-tenant.png" id="123" name="Picture"/>
+                    <pic:cNvPr descr="/home/idrissa_yameogo/projets/ycognicore-cloud/docs/rapports/captures/10/61-test12-tenant.png" id="126" name="Picture"/>
                     <pic:cNvPicPr>
                       <a:picLocks noChangeArrowheads="1" noChangeAspect="1"/>
                     </pic:cNvPicPr>
                   </pic:nvPicPr>
                   <pic:blipFill>
-                    <a:blip r:embed="rId121"/>
+                    <a:blip r:embed="rId124"/>
                     <a:stretch>
                       <a:fillRect/>
                     </a:stretch>
@@ -5853,18 +5920,18 @@
           <wp:inline>
             <wp:extent cx="5334000" cy="1066800"/>
             <wp:effectExtent b="0" l="0" r="0" t="0"/>
-            <wp:docPr descr="Test 10 Tenant : NOTICE OK — VERROUILLE après 5 échecs." title="" id="125" name="Picture"/>
+            <wp:docPr descr="Test 10 Tenant : NOTICE OK — VERROUILLE après 5 échecs." title="" id="128" name="Picture"/>
             <a:graphic>
               <a:graphicData uri="http://schemas.openxmlformats.org/drawingml/2006/picture">
                 <pic:pic>
                   <pic:nvPicPr>
-                    <pic:cNvPr descr="/home/idrissa_yameogo/projets/ycognicore-cloud/docs/rapports/captures/10/60-test10-tenant.png" id="126" name="Picture"/>
+                    <pic:cNvPr descr="/home/idrissa_yameogo/projets/ycognicore-cloud/docs/rapports/captures/10/60-test10-tenant.png" id="129" name="Picture"/>
                     <pic:cNvPicPr>
                       <a:picLocks noChangeArrowheads="1" noChangeAspect="1"/>
                     </pic:cNvPicPr>
                   </pic:nvPicPr>
                   <pic:blipFill>
-                    <a:blip r:embed="rId124"/>
+                    <a:blip r:embed="rId127"/>
                     <a:stretch>
                       <a:fillRect/>
                     </a:stretch>
@@ -5920,18 +5987,18 @@
           <wp:inline>
             <wp:extent cx="5334000" cy="1010652"/>
             <wp:effectExtent b="0" l="0" r="0" t="0"/>
-            <wp:docPr descr="Test 6 CP : 6 fonctions critiques créées." title="" id="128" name="Picture"/>
+            <wp:docPr descr="Test 6 CP : 6 fonctions critiques créées." title="" id="131" name="Picture"/>
             <a:graphic>
               <a:graphicData uri="http://schemas.openxmlformats.org/drawingml/2006/picture">
                 <pic:pic>
                   <pic:nvPicPr>
-                    <pic:cNvPr descr="/home/idrissa_yameogo/projets/ycognicore-cloud/docs/rapports/captures/10/55-test6-cp.png" id="129" name="Picture"/>
+                    <pic:cNvPr descr="/home/idrissa_yameogo/projets/ycognicore-cloud/docs/rapports/captures/10/55-test6-cp.png" id="132" name="Picture"/>
                     <pic:cNvPicPr>
                       <a:picLocks noChangeArrowheads="1" noChangeAspect="1"/>
                     </pic:cNvPicPr>
                   </pic:nvPicPr>
                   <pic:blipFill>
-                    <a:blip r:embed="rId127"/>
+                    <a:blip r:embed="rId130"/>
                     <a:stretch>
                       <a:fillRect/>
                     </a:stretch>
@@ -5987,18 +6054,18 @@
           <wp:inline>
             <wp:extent cx="5334000" cy="1179094"/>
             <wp:effectExtent b="0" l="0" r="0" t="0"/>
-            <wp:docPr descr="Test 5 CP : 6 triggers d’immuabilité actifs." title="" id="131" name="Picture"/>
+            <wp:docPr descr="Test 5 CP : 6 triggers d’immuabilité actifs." title="" id="134" name="Picture"/>
             <a:graphic>
               <a:graphicData uri="http://schemas.openxmlformats.org/drawingml/2006/picture">
                 <pic:pic>
                   <pic:nvPicPr>
-                    <pic:cNvPr descr="/home/idrissa_yameogo/projets/ycognicore-cloud/docs/rapports/captures/10/54-test5-cp.png" id="132" name="Picture"/>
+                    <pic:cNvPr descr="/home/idrissa_yameogo/projets/ycognicore-cloud/docs/rapports/captures/10/54-test5-cp.png" id="135" name="Picture"/>
                     <pic:cNvPicPr>
                       <a:picLocks noChangeArrowheads="1" noChangeAspect="1"/>
                     </pic:cNvPicPr>
                   </pic:nvPicPr>
                   <pic:blipFill>
-                    <a:blip r:embed="rId130"/>
+                    <a:blip r:embed="rId133"/>
                     <a:stretch>
                       <a:fillRect/>
                     </a:stretch>
@@ -6054,18 +6121,18 @@
           <wp:inline>
             <wp:extent cx="5334000" cy="1122947"/>
             <wp:effectExtent b="0" l="0" r="0" t="0"/>
-            <wp:docPr descr="Test 4 CP : 11 colonnes critiques vérifiées." title="" id="134" name="Picture"/>
+            <wp:docPr descr="Test 4 CP : 11 colonnes critiques vérifiées." title="" id="137" name="Picture"/>
             <a:graphic>
               <a:graphicData uri="http://schemas.openxmlformats.org/drawingml/2006/picture">
                 <pic:pic>
                   <pic:nvPicPr>
-                    <pic:cNvPr descr="/home/idrissa_yameogo/projets/ycognicore-cloud/docs/rapports/captures/10/53-test4-cp.png" id="135" name="Picture"/>
+                    <pic:cNvPr descr="/home/idrissa_yameogo/projets/ycognicore-cloud/docs/rapports/captures/10/53-test4-cp.png" id="138" name="Picture"/>
                     <pic:cNvPicPr>
                       <a:picLocks noChangeArrowheads="1" noChangeAspect="1"/>
                     </pic:cNvPicPr>
                   </pic:nvPicPr>
                   <pic:blipFill>
-                    <a:blip r:embed="rId133"/>
+                    <a:blip r:embed="rId136"/>
                     <a:stretch>
                       <a:fillRect/>
                     </a:stretch>
@@ -6121,18 +6188,18 @@
           <wp:inline>
             <wp:extent cx="5334000" cy="842210"/>
             <wp:effectExtent b="0" l="0" r="0" t="0"/>
-            <wp:docPr descr="Test 3 CP : 0 table manquante (toutes présentes)." title="" id="137" name="Picture"/>
+            <wp:docPr descr="Test 3 CP : 0 table manquante (toutes présentes)." title="" id="140" name="Picture"/>
             <a:graphic>
               <a:graphicData uri="http://schemas.openxmlformats.org/drawingml/2006/picture">
                 <pic:pic>
                   <pic:nvPicPr>
-                    <pic:cNvPr descr="/home/idrissa_yameogo/projets/ycognicore-cloud/docs/rapports/captures/10/52-test3-cp.png" id="138" name="Picture"/>
+                    <pic:cNvPr descr="/home/idrissa_yameogo/projets/ycognicore-cloud/docs/rapports/captures/10/52-test3-cp.png" id="141" name="Picture"/>
                     <pic:cNvPicPr>
                       <a:picLocks noChangeArrowheads="1" noChangeAspect="1"/>
                     </pic:cNvPicPr>
                   </pic:nvPicPr>
                   <pic:blipFill>
-                    <a:blip r:embed="rId136"/>
+                    <a:blip r:embed="rId139"/>
                     <a:stretch>
                       <a:fillRect/>
                     </a:stretch>
@@ -6210,9 +6277,9 @@
         </w:pict>
       </w:r>
     </w:p>
-    <w:bookmarkEnd w:id="139"/>
-    <w:bookmarkEnd w:id="140"/>
-    <w:bookmarkStart w:id="145" w:name="modélisation-des-données-et-architecture"/>
+    <w:bookmarkEnd w:id="142"/>
+    <w:bookmarkEnd w:id="143"/>
+    <w:bookmarkStart w:id="148" w:name="modélisation-des-données-et-architecture"/>
     <w:p>
       <w:pPr>
         <w:pStyle w:val="Heading2"/>
@@ -6230,7 +6297,7 @@
         <w:t xml:space="preserve">4. Modélisation des données et architecture</w:t>
       </w:r>
     </w:p>
-    <w:bookmarkStart w:id="141" w:name="X23c8fde4ec4edca3e029116b186b9f96399fb97"/>
+    <w:bookmarkStart w:id="144" w:name="X23c8fde4ec4edca3e029116b186b9f96399fb97"/>
     <w:p>
       <w:pPr>
         <w:pStyle w:val="Heading3"/>
@@ -6583,8 +6650,8 @@
         </w:tc>
       </w:tr>
     </w:tbl>
-    <w:bookmarkEnd w:id="141"/>
-    <w:bookmarkStart w:id="142" w:name="schéma-tenant-14-tables-8-partitions"/>
+    <w:bookmarkEnd w:id="144"/>
+    <w:bookmarkStart w:id="145" w:name="schéma-tenant-14-tables-8-partitions"/>
     <w:p>
       <w:pPr>
         <w:pStyle w:val="Heading3"/>
@@ -6937,8 +7004,8 @@
         </w:tc>
       </w:tr>
     </w:tbl>
-    <w:bookmarkEnd w:id="142"/>
-    <w:bookmarkStart w:id="143" w:name="architecture-docker"/>
+    <w:bookmarkEnd w:id="145"/>
+    <w:bookmarkStart w:id="146" w:name="architecture-docker"/>
     <w:p>
       <w:pPr>
         <w:pStyle w:val="Heading3"/>
@@ -6964,8 +7031,8 @@
         <w:t xml:space="preserve">4 services orchestrés : PostgreSQL 16, Redis 7-alpine, Vault 1.17.6, MinIO (pgsty).</w:t>
       </w:r>
     </w:p>
-    <w:bookmarkEnd w:id="143"/>
-    <w:bookmarkStart w:id="144" w:name="architecture-spring-boot"/>
+    <w:bookmarkEnd w:id="146"/>
+    <w:bookmarkStart w:id="147" w:name="architecture-spring-boot"/>
     <w:p>
       <w:pPr>
         <w:pStyle w:val="Heading3"/>
@@ -6998,9 +7065,9 @@
         </w:pict>
       </w:r>
     </w:p>
-    <w:bookmarkEnd w:id="144"/>
-    <w:bookmarkEnd w:id="145"/>
-    <w:bookmarkStart w:id="160" w:name="résolution-de-problèmes-détaillée"/>
+    <w:bookmarkEnd w:id="147"/>
+    <w:bookmarkEnd w:id="148"/>
+    <w:bookmarkStart w:id="163" w:name="résolution-de-problèmes-détaillée"/>
     <w:p>
       <w:pPr>
         <w:pStyle w:val="Heading2"/>
@@ -7030,7 +7097,7 @@
         <w:t xml:space="preserve">11 problèmes rencontrés et résolus au cours de la journée.</w:t>
       </w:r>
     </w:p>
-    <w:bookmarkStart w:id="146" w:name="Xc3ad0c681f250d4f3d04f000e891a07ca78ddac"/>
+    <w:bookmarkStart w:id="149" w:name="Xc3ad0c681f250d4f3d04f000e891a07ca78ddac"/>
     <w:p>
       <w:pPr>
         <w:pStyle w:val="Heading3"/>
@@ -7078,8 +7145,8 @@
         <w:t xml:space="preserve">.</w:t>
       </w:r>
     </w:p>
-    <w:bookmarkEnd w:id="146"/>
-    <w:bookmarkStart w:id="147" w:name="problème-2-flyway-ne-sexécute-pas-boot-4"/>
+    <w:bookmarkEnd w:id="149"/>
+    <w:bookmarkStart w:id="150" w:name="problème-2-flyway-ne-sexécute-pas-boot-4"/>
     <w:p>
       <w:pPr>
         <w:pStyle w:val="Heading3"/>
@@ -7130,8 +7197,8 @@
         <w:t xml:space="preserve">explicite.</w:t>
       </w:r>
     </w:p>
-    <w:bookmarkEnd w:id="147"/>
-    <w:bookmarkStart w:id="151" w:name="X1ac4f147704a9ce9cf792dc40b0939b9e353941"/>
+    <w:bookmarkEnd w:id="150"/>
+    <w:bookmarkStart w:id="154" w:name="X1ac4f147704a9ce9cf792dc40b0939b9e353941"/>
     <w:p>
       <w:pPr>
         <w:pStyle w:val="Heading3"/>
@@ -7176,18 +7243,18 @@
           <wp:inline>
             <wp:extent cx="5334000" cy="3017570"/>
             <wp:effectExtent b="0" l="0" r="0" t="0"/>
-            <wp:docPr descr="Structure partition_maintenance_log" title="" id="149" name="Picture"/>
+            <wp:docPr descr="Structure partition_maintenance_log" title="" id="152" name="Picture"/>
             <a:graphic>
               <a:graphicData uri="http://schemas.openxmlformats.org/drawingml/2006/picture">
                 <pic:pic>
                   <pic:nvPicPr>
-                    <pic:cNvPr descr="/home/idrissa_yameogo/projets/ycognicore-cloud/docs/rapports/captures/10/24-partition-table.png" id="150" name="Picture"/>
+                    <pic:cNvPr descr="/home/idrissa_yameogo/projets/ycognicore-cloud/docs/rapports/captures/10/24-partition-table.png" id="153" name="Picture"/>
                     <pic:cNvPicPr>
                       <a:picLocks noChangeArrowheads="1" noChangeAspect="1"/>
                     </pic:cNvPicPr>
                   </pic:nvPicPr>
                   <pic:blipFill>
-                    <a:blip r:embed="rId148"/>
+                    <a:blip r:embed="rId151"/>
                     <a:stretch>
                       <a:fillRect/>
                     </a:stretch>
@@ -7240,8 +7307,8 @@
         <w:t xml:space="preserve">.</w:t>
       </w:r>
     </w:p>
-    <w:bookmarkEnd w:id="151"/>
-    <w:bookmarkStart w:id="152" w:name="problème-4-endpoint-401-unauthorized"/>
+    <w:bookmarkEnd w:id="154"/>
+    <w:bookmarkStart w:id="155" w:name="problème-4-endpoint-401-unauthorized"/>
     <w:p>
       <w:pPr>
         <w:pStyle w:val="Heading3"/>
@@ -7283,8 +7350,8 @@
         <w:t xml:space="preserve">.</w:t>
       </w:r>
     </w:p>
-    <w:bookmarkEnd w:id="152"/>
-    <w:bookmarkStart w:id="153" w:name="problème-5-0-tenants-détectés"/>
+    <w:bookmarkEnd w:id="155"/>
+    <w:bookmarkStart w:id="156" w:name="problème-5-0-tenants-détectés"/>
     <w:p>
       <w:pPr>
         <w:pStyle w:val="Heading3"/>
@@ -7332,8 +7399,8 @@
         <w:t xml:space="preserve">.</w:t>
       </w:r>
     </w:p>
-    <w:bookmarkEnd w:id="153"/>
-    <w:bookmarkStart w:id="154" w:name="problème-6-12-erreurs-password"/>
+    <w:bookmarkEnd w:id="156"/>
+    <w:bookmarkStart w:id="157" w:name="problème-6-12-erreurs-password"/>
     <w:p>
       <w:pPr>
         <w:pStyle w:val="Heading3"/>
@@ -7375,8 +7442,8 @@
         <w:t xml:space="preserve">.</w:t>
       </w:r>
     </w:p>
-    <w:bookmarkEnd w:id="154"/>
-    <w:bookmarkStart w:id="155" w:name="problème-7-ddl-create-interdit"/>
+    <w:bookmarkEnd w:id="157"/>
+    <w:bookmarkStart w:id="158" w:name="problème-7-ddl-create-interdit"/>
     <w:p>
       <w:pPr>
         <w:pStyle w:val="Heading3"/>
@@ -7424,8 +7491,8 @@
         <w:t xml:space="preserve">.</w:t>
       </w:r>
     </w:p>
-    <w:bookmarkEnd w:id="155"/>
-    <w:bookmarkStart w:id="156" w:name="problème-8-image-minio-retirée"/>
+    <w:bookmarkEnd w:id="158"/>
+    <w:bookmarkStart w:id="159" w:name="problème-8-image-minio-retirée"/>
     <w:p>
       <w:pPr>
         <w:pStyle w:val="Heading3"/>
@@ -7467,8 +7534,8 @@
         <w:t xml:space="preserve">.</w:t>
       </w:r>
     </w:p>
-    <w:bookmarkEnd w:id="156"/>
-    <w:bookmarkStart w:id="157" w:name="problème-9-healthcheck-vault-ipv6"/>
+    <w:bookmarkEnd w:id="159"/>
+    <w:bookmarkStart w:id="160" w:name="problème-9-healthcheck-vault-ipv6"/>
     <w:p>
       <w:pPr>
         <w:pStyle w:val="Heading3"/>
@@ -7510,8 +7577,8 @@
         <w:t xml:space="preserve">.</w:t>
       </w:r>
     </w:p>
-    <w:bookmarkEnd w:id="157"/>
-    <w:bookmarkStart w:id="158" w:name="problème-10-boto3-absent"/>
+    <w:bookmarkEnd w:id="160"/>
+    <w:bookmarkStart w:id="161" w:name="problème-10-boto3-absent"/>
     <w:p>
       <w:pPr>
         <w:pStyle w:val="Heading3"/>
@@ -7562,8 +7629,8 @@
         <w:t xml:space="preserve">éphémère.</w:t>
       </w:r>
     </w:p>
-    <w:bookmarkEnd w:id="158"/>
-    <w:bookmarkStart w:id="159" w:name="problème-11-mc-non-téléchargeable"/>
+    <w:bookmarkEnd w:id="161"/>
+    <w:bookmarkStart w:id="162" w:name="problème-11-mc-non-téléchargeable"/>
     <w:p>
       <w:pPr>
         <w:pStyle w:val="Heading3"/>
@@ -7606,9 +7673,9 @@
         </w:pict>
       </w:r>
     </w:p>
-    <w:bookmarkEnd w:id="159"/>
-    <w:bookmarkEnd w:id="160"/>
-    <w:bookmarkStart w:id="163" w:name="résultats-obtenus"/>
+    <w:bookmarkEnd w:id="162"/>
+    <w:bookmarkEnd w:id="163"/>
+    <w:bookmarkStart w:id="166" w:name="résultats-obtenus"/>
     <w:p>
       <w:pPr>
         <w:pStyle w:val="Heading2"/>
@@ -7626,7 +7693,7 @@
         <w:t xml:space="preserve">6. Résultats obtenus</w:t>
       </w:r>
     </w:p>
-    <w:bookmarkStart w:id="161" w:name="livrables-produits"/>
+    <w:bookmarkStart w:id="164" w:name="livrables-produits"/>
     <w:p>
       <w:pPr>
         <w:pStyle w:val="Heading3"/>
@@ -8002,8 +8069,8 @@
         </w:tc>
       </w:tr>
     </w:tbl>
-    <w:bookmarkEnd w:id="161"/>
-    <w:bookmarkStart w:id="162" w:name="statistiques-de-la-journée"/>
+    <w:bookmarkEnd w:id="164"/>
+    <w:bookmarkStart w:id="165" w:name="statistiques-de-la-journée"/>
     <w:p>
       <w:pPr>
         <w:pStyle w:val="Heading3"/>
@@ -8258,9 +8325,16 @@
         </w:pict>
       </w:r>
     </w:p>
-    <w:bookmarkEnd w:id="162"/>
-    <w:bookmarkEnd w:id="163"/>
-    <w:bookmarkStart w:id="168" w:name="bilan-et-prochaines-étapes"/>
+    <w:p>
+      <w:r>
+        <w:pict>
+          <v:rect style="width:0;height:1.5pt" o:hralign="center" o:hrstd="t" o:hr="t"/>
+        </w:pict>
+      </w:r>
+    </w:p>
+    <w:bookmarkEnd w:id="165"/>
+    <w:bookmarkEnd w:id="166"/>
+    <w:bookmarkStart w:id="243" w:name="annexe-galerie-complète-des-captures"/>
     <w:p>
       <w:pPr>
         <w:pStyle w:val="Heading2"/>
@@ -8275,10 +8349,1675 @@
         <w:tab/>
       </w:r>
       <w:r>
+        <w:t xml:space="preserve">Annexe — Galerie complète des captures</w:t>
+      </w:r>
+    </w:p>
+    <w:p>
+      <w:pPr>
+        <w:pStyle w:val="FirstParagraph"/>
+      </w:pPr>
+      <w:r>
+        <w:rPr>
+          <w:i/>
+          <w:iCs/>
+        </w:rPr>
+        <w:t xml:space="preserve">Cette annexe regroupe les 19 captures complémentaires produites durant la journée du 30 septembre 2026.</w:t>
+      </w:r>
+    </w:p>
+    <w:bookmarkStart w:id="170" w:name="a.1-20-nb-tables-seeds"/>
+    <w:p>
+      <w:pPr>
+        <w:pStyle w:val="Heading3"/>
+      </w:pPr>
+      <w:r>
+        <w:rPr>
+          <w:rStyle w:val="SectionNumber"/>
+        </w:rPr>
+        <w:t xml:space="preserve">1.9.1</w:t>
+      </w:r>
+      <w:r>
+        <w:tab/>
+      </w:r>
+      <w:r>
+        <w:t xml:space="preserve">A.1 — 20 nb tables seeds</w:t>
+      </w:r>
+    </w:p>
+    <w:p>
+      <w:pPr>
+        <w:pStyle w:val="CaptionedFigure"/>
+      </w:pPr>
+      <w:r>
+        <w:drawing>
+          <wp:inline>
+            <wp:extent cx="5334000" cy="3297381"/>
+            <wp:effectExtent b="0" l="0" r="0" t="0"/>
+            <wp:docPr descr="20 nb tables seeds" title="" id="168" name="Picture"/>
+            <a:graphic>
+              <a:graphicData uri="http://schemas.openxmlformats.org/drawingml/2006/picture">
+                <pic:pic>
+                  <pic:nvPicPr>
+                    <pic:cNvPr descr="/home/idrissa_yameogo/projets/ycognicore-cloud/docs/rapports/captures/10/20-nb-tables-seeds.png" id="169" name="Picture"/>
+                    <pic:cNvPicPr>
+                      <a:picLocks noChangeArrowheads="1" noChangeAspect="1"/>
+                    </pic:cNvPicPr>
+                  </pic:nvPicPr>
+                  <pic:blipFill>
+                    <a:blip r:embed="rId167"/>
+                    <a:stretch>
+                      <a:fillRect/>
+                    </a:stretch>
+                  </pic:blipFill>
+                  <pic:spPr bwMode="auto">
+                    <a:xfrm>
+                      <a:off x="0" y="0"/>
+                      <a:ext cx="5334000" cy="3297381"/>
+                    </a:xfrm>
+                    <a:prstGeom prst="rect">
+                      <a:avLst/>
+                    </a:prstGeom>
+                    <a:noFill/>
+                    <a:ln w="9525">
+                      <a:noFill/>
+                      <a:headEnd/>
+                      <a:tailEnd/>
+                    </a:ln>
+                  </pic:spPr>
+                </pic:pic>
+              </a:graphicData>
+            </a:graphic>
+          </wp:inline>
+        </w:drawing>
+      </w:r>
+    </w:p>
+    <w:p>
+      <w:pPr>
+        <w:pStyle w:val="ImageCaption"/>
+      </w:pPr>
+      <w:r>
+        <w:t xml:space="preserve">20 nb tables seeds</w:t>
+      </w:r>
+    </w:p>
+    <w:p>
+      <w:pPr>
+        <w:pStyle w:val="BodyText"/>
+      </w:pPr>
+      <w:r>
+        <w:rPr>
+          <w:i/>
+          <w:iCs/>
+        </w:rPr>
+        <w:t xml:space="preserve">Figure A.1 — 20 nb tables seeds.</w:t>
+      </w:r>
+    </w:p>
+    <w:bookmarkEnd w:id="170"/>
+    <w:bookmarkStart w:id="174" w:name="a.2-21-etat-apres-seed"/>
+    <w:p>
+      <w:pPr>
+        <w:pStyle w:val="Heading3"/>
+      </w:pPr>
+      <w:r>
+        <w:rPr>
+          <w:rStyle w:val="SectionNumber"/>
+        </w:rPr>
+        <w:t xml:space="preserve">1.9.2</w:t>
+      </w:r>
+      <w:r>
+        <w:tab/>
+      </w:r>
+      <w:r>
+        <w:t xml:space="preserve">A.2 — 21 etat apres seed</w:t>
+      </w:r>
+    </w:p>
+    <w:p>
+      <w:pPr>
+        <w:pStyle w:val="CaptionedFigure"/>
+      </w:pPr>
+      <w:r>
+        <w:drawing>
+          <wp:inline>
+            <wp:extent cx="5334000" cy="1369995"/>
+            <wp:effectExtent b="0" l="0" r="0" t="0"/>
+            <wp:docPr descr="21 etat apres seed" title="" id="172" name="Picture"/>
+            <a:graphic>
+              <a:graphicData uri="http://schemas.openxmlformats.org/drawingml/2006/picture">
+                <pic:pic>
+                  <pic:nvPicPr>
+                    <pic:cNvPr descr="/home/idrissa_yameogo/projets/ycognicore-cloud/docs/rapports/captures/10/21-etat-apres-seed.png" id="173" name="Picture"/>
+                    <pic:cNvPicPr>
+                      <a:picLocks noChangeArrowheads="1" noChangeAspect="1"/>
+                    </pic:cNvPicPr>
+                  </pic:nvPicPr>
+                  <pic:blipFill>
+                    <a:blip r:embed="rId171"/>
+                    <a:stretch>
+                      <a:fillRect/>
+                    </a:stretch>
+                  </pic:blipFill>
+                  <pic:spPr bwMode="auto">
+                    <a:xfrm>
+                      <a:off x="0" y="0"/>
+                      <a:ext cx="5334000" cy="1369995"/>
+                    </a:xfrm>
+                    <a:prstGeom prst="rect">
+                      <a:avLst/>
+                    </a:prstGeom>
+                    <a:noFill/>
+                    <a:ln w="9525">
+                      <a:noFill/>
+                      <a:headEnd/>
+                      <a:tailEnd/>
+                    </a:ln>
+                  </pic:spPr>
+                </pic:pic>
+              </a:graphicData>
+            </a:graphic>
+          </wp:inline>
+        </w:drawing>
+      </w:r>
+    </w:p>
+    <w:p>
+      <w:pPr>
+        <w:pStyle w:val="ImageCaption"/>
+      </w:pPr>
+      <w:r>
+        <w:t xml:space="preserve">21 etat apres seed</w:t>
+      </w:r>
+    </w:p>
+    <w:p>
+      <w:pPr>
+        <w:pStyle w:val="BodyText"/>
+      </w:pPr>
+      <w:r>
+        <w:rPr>
+          <w:i/>
+          <w:iCs/>
+        </w:rPr>
+        <w:t xml:space="preserve">Figure A.2 — 21 etat apres seed.</w:t>
+      </w:r>
+    </w:p>
+    <w:bookmarkEnd w:id="174"/>
+    <w:bookmarkStart w:id="178" w:name="a.3-22-flyway-history-7"/>
+    <w:p>
+      <w:pPr>
+        <w:pStyle w:val="Heading3"/>
+      </w:pPr>
+      <w:r>
+        <w:rPr>
+          <w:rStyle w:val="SectionNumber"/>
+        </w:rPr>
+        <w:t xml:space="preserve">1.9.3</w:t>
+      </w:r>
+      <w:r>
+        <w:tab/>
+      </w:r>
+      <w:r>
+        <w:t xml:space="preserve">A.3 — 22 flyway history 7</w:t>
+      </w:r>
+    </w:p>
+    <w:p>
+      <w:pPr>
+        <w:pStyle w:val="CaptionedFigure"/>
+      </w:pPr>
+      <w:r>
+        <w:drawing>
+          <wp:inline>
+            <wp:extent cx="5334000" cy="2236838"/>
+            <wp:effectExtent b="0" l="0" r="0" t="0"/>
+            <wp:docPr descr="22 flyway history 7" title="" id="176" name="Picture"/>
+            <a:graphic>
+              <a:graphicData uri="http://schemas.openxmlformats.org/drawingml/2006/picture">
+                <pic:pic>
+                  <pic:nvPicPr>
+                    <pic:cNvPr descr="/home/idrissa_yameogo/projets/ycognicore-cloud/docs/rapports/captures/10/22-flyway-history-7.png" id="177" name="Picture"/>
+                    <pic:cNvPicPr>
+                      <a:picLocks noChangeArrowheads="1" noChangeAspect="1"/>
+                    </pic:cNvPicPr>
+                  </pic:nvPicPr>
+                  <pic:blipFill>
+                    <a:blip r:embed="rId175"/>
+                    <a:stretch>
+                      <a:fillRect/>
+                    </a:stretch>
+                  </pic:blipFill>
+                  <pic:spPr bwMode="auto">
+                    <a:xfrm>
+                      <a:off x="0" y="0"/>
+                      <a:ext cx="5334000" cy="2236838"/>
+                    </a:xfrm>
+                    <a:prstGeom prst="rect">
+                      <a:avLst/>
+                    </a:prstGeom>
+                    <a:noFill/>
+                    <a:ln w="9525">
+                      <a:noFill/>
+                      <a:headEnd/>
+                      <a:tailEnd/>
+                    </a:ln>
+                  </pic:spPr>
+                </pic:pic>
+              </a:graphicData>
+            </a:graphic>
+          </wp:inline>
+        </w:drawing>
+      </w:r>
+    </w:p>
+    <w:p>
+      <w:pPr>
+        <w:pStyle w:val="ImageCaption"/>
+      </w:pPr>
+      <w:r>
+        <w:t xml:space="preserve">22 flyway history 7</w:t>
+      </w:r>
+    </w:p>
+    <w:p>
+      <w:pPr>
+        <w:pStyle w:val="BodyText"/>
+      </w:pPr>
+      <w:r>
+        <w:rPr>
+          <w:i/>
+          <w:iCs/>
+        </w:rPr>
+        <w:t xml:space="preserve">Figure A.3 — 22 flyway history 7.</w:t>
+      </w:r>
+    </w:p>
+    <w:bookmarkEnd w:id="178"/>
+    <w:bookmarkStart w:id="182" w:name="a.4-25-compilation-demarrage"/>
+    <w:p>
+      <w:pPr>
+        <w:pStyle w:val="Heading3"/>
+      </w:pPr>
+      <w:r>
+        <w:rPr>
+          <w:rStyle w:val="SectionNumber"/>
+        </w:rPr>
+        <w:t xml:space="preserve">1.9.4</w:t>
+      </w:r>
+      <w:r>
+        <w:tab/>
+      </w:r>
+      <w:r>
+        <w:t xml:space="preserve">A.4 — 25 compilation demarrage</w:t>
+      </w:r>
+    </w:p>
+    <w:p>
+      <w:pPr>
+        <w:pStyle w:val="CaptionedFigure"/>
+      </w:pPr>
+      <w:r>
+        <w:drawing>
+          <wp:inline>
+            <wp:extent cx="5334000" cy="1874878"/>
+            <wp:effectExtent b="0" l="0" r="0" t="0"/>
+            <wp:docPr descr="25 compilation demarrage" title="" id="180" name="Picture"/>
+            <a:graphic>
+              <a:graphicData uri="http://schemas.openxmlformats.org/drawingml/2006/picture">
+                <pic:pic>
+                  <pic:nvPicPr>
+                    <pic:cNvPr descr="/home/idrissa_yameogo/projets/ycognicore-cloud/docs/rapports/captures/10/25-compilation-demarrage.png" id="181" name="Picture"/>
+                    <pic:cNvPicPr>
+                      <a:picLocks noChangeArrowheads="1" noChangeAspect="1"/>
+                    </pic:cNvPicPr>
+                  </pic:nvPicPr>
+                  <pic:blipFill>
+                    <a:blip r:embed="rId179"/>
+                    <a:stretch>
+                      <a:fillRect/>
+                    </a:stretch>
+                  </pic:blipFill>
+                  <pic:spPr bwMode="auto">
+                    <a:xfrm>
+                      <a:off x="0" y="0"/>
+                      <a:ext cx="5334000" cy="1874878"/>
+                    </a:xfrm>
+                    <a:prstGeom prst="rect">
+                      <a:avLst/>
+                    </a:prstGeom>
+                    <a:noFill/>
+                    <a:ln w="9525">
+                      <a:noFill/>
+                      <a:headEnd/>
+                      <a:tailEnd/>
+                    </a:ln>
+                  </pic:spPr>
+                </pic:pic>
+              </a:graphicData>
+            </a:graphic>
+          </wp:inline>
+        </w:drawing>
+      </w:r>
+    </w:p>
+    <w:p>
+      <w:pPr>
+        <w:pStyle w:val="ImageCaption"/>
+      </w:pPr>
+      <w:r>
+        <w:t xml:space="preserve">25 compilation demarrage</w:t>
+      </w:r>
+    </w:p>
+    <w:p>
+      <w:pPr>
+        <w:pStyle w:val="BodyText"/>
+      </w:pPr>
+      <w:r>
+        <w:rPr>
+          <w:i/>
+          <w:iCs/>
+        </w:rPr>
+        <w:t xml:space="preserve">Figure A.4 — 25 compilation demarrage.</w:t>
+      </w:r>
+    </w:p>
+    <w:bookmarkEnd w:id="182"/>
+    <w:bookmarkStart w:id="186" w:name="a.5-26-endpoint-0"/>
+    <w:p>
+      <w:pPr>
+        <w:pStyle w:val="Heading3"/>
+      </w:pPr>
+      <w:r>
+        <w:rPr>
+          <w:rStyle w:val="SectionNumber"/>
+        </w:rPr>
+        <w:t xml:space="preserve">1.9.5</w:t>
+      </w:r>
+      <w:r>
+        <w:tab/>
+      </w:r>
+      <w:r>
+        <w:t xml:space="preserve">A.5 — 26 endpoint 0</w:t>
+      </w:r>
+    </w:p>
+    <w:p>
+      <w:pPr>
+        <w:pStyle w:val="CaptionedFigure"/>
+      </w:pPr>
+      <w:r>
+        <w:drawing>
+          <wp:inline>
+            <wp:extent cx="5334000" cy="5548018"/>
+            <wp:effectExtent b="0" l="0" r="0" t="0"/>
+            <wp:docPr descr="26 endpoint 0" title="" id="184" name="Picture"/>
+            <a:graphic>
+              <a:graphicData uri="http://schemas.openxmlformats.org/drawingml/2006/picture">
+                <pic:pic>
+                  <pic:nvPicPr>
+                    <pic:cNvPr descr="/home/idrissa_yameogo/projets/ycognicore-cloud/docs/rapports/captures/10/26-endpoint-0.png" id="185" name="Picture"/>
+                    <pic:cNvPicPr>
+                      <a:picLocks noChangeArrowheads="1" noChangeAspect="1"/>
+                    </pic:cNvPicPr>
+                  </pic:nvPicPr>
+                  <pic:blipFill>
+                    <a:blip r:embed="rId183"/>
+                    <a:stretch>
+                      <a:fillRect/>
+                    </a:stretch>
+                  </pic:blipFill>
+                  <pic:spPr bwMode="auto">
+                    <a:xfrm>
+                      <a:off x="0" y="0"/>
+                      <a:ext cx="5334000" cy="5548018"/>
+                    </a:xfrm>
+                    <a:prstGeom prst="rect">
+                      <a:avLst/>
+                    </a:prstGeom>
+                    <a:noFill/>
+                    <a:ln w="9525">
+                      <a:noFill/>
+                      <a:headEnd/>
+                      <a:tailEnd/>
+                    </a:ln>
+                  </pic:spPr>
+                </pic:pic>
+              </a:graphicData>
+            </a:graphic>
+          </wp:inline>
+        </w:drawing>
+      </w:r>
+    </w:p>
+    <w:p>
+      <w:pPr>
+        <w:pStyle w:val="ImageCaption"/>
+      </w:pPr>
+      <w:r>
+        <w:t xml:space="preserve">26 endpoint 0</w:t>
+      </w:r>
+    </w:p>
+    <w:p>
+      <w:pPr>
+        <w:pStyle w:val="BodyText"/>
+      </w:pPr>
+      <w:r>
+        <w:rPr>
+          <w:i/>
+          <w:iCs/>
+        </w:rPr>
+        <w:t xml:space="preserve">Figure A.5 — 26 endpoint 0.</w:t>
+      </w:r>
+    </w:p>
+    <w:bookmarkEnd w:id="186"/>
+    <w:bookmarkStart w:id="190" w:name="a.6-27-errors-password"/>
+    <w:p>
+      <w:pPr>
+        <w:pStyle w:val="Heading3"/>
+      </w:pPr>
+      <w:r>
+        <w:rPr>
+          <w:rStyle w:val="SectionNumber"/>
+        </w:rPr>
+        <w:t xml:space="preserve">1.9.6</w:t>
+      </w:r>
+      <w:r>
+        <w:tab/>
+      </w:r>
+      <w:r>
+        <w:t xml:space="preserve">A.6 — 27 errors password</w:t>
+      </w:r>
+    </w:p>
+    <w:p>
+      <w:pPr>
+        <w:pStyle w:val="CaptionedFigure"/>
+      </w:pPr>
+      <w:r>
+        <w:drawing>
+          <wp:inline>
+            <wp:extent cx="5334000" cy="1703294"/>
+            <wp:effectExtent b="0" l="0" r="0" t="0"/>
+            <wp:docPr descr="27 errors password" title="" id="188" name="Picture"/>
+            <a:graphic>
+              <a:graphicData uri="http://schemas.openxmlformats.org/drawingml/2006/picture">
+                <pic:pic>
+                  <pic:nvPicPr>
+                    <pic:cNvPr descr="/home/idrissa_yameogo/projets/ycognicore-cloud/docs/rapports/captures/10/27-errors-password.png" id="189" name="Picture"/>
+                    <pic:cNvPicPr>
+                      <a:picLocks noChangeArrowheads="1" noChangeAspect="1"/>
+                    </pic:cNvPicPr>
+                  </pic:nvPicPr>
+                  <pic:blipFill>
+                    <a:blip r:embed="rId187"/>
+                    <a:stretch>
+                      <a:fillRect/>
+                    </a:stretch>
+                  </pic:blipFill>
+                  <pic:spPr bwMode="auto">
+                    <a:xfrm>
+                      <a:off x="0" y="0"/>
+                      <a:ext cx="5334000" cy="1703294"/>
+                    </a:xfrm>
+                    <a:prstGeom prst="rect">
+                      <a:avLst/>
+                    </a:prstGeom>
+                    <a:noFill/>
+                    <a:ln w="9525">
+                      <a:noFill/>
+                      <a:headEnd/>
+                      <a:tailEnd/>
+                    </a:ln>
+                  </pic:spPr>
+                </pic:pic>
+              </a:graphicData>
+            </a:graphic>
+          </wp:inline>
+        </w:drawing>
+      </w:r>
+    </w:p>
+    <w:p>
+      <w:pPr>
+        <w:pStyle w:val="ImageCaption"/>
+      </w:pPr>
+      <w:r>
+        <w:t xml:space="preserve">27 errors password</w:t>
+      </w:r>
+    </w:p>
+    <w:p>
+      <w:pPr>
+        <w:pStyle w:val="BodyText"/>
+      </w:pPr>
+      <w:r>
+        <w:rPr>
+          <w:i/>
+          <w:iCs/>
+        </w:rPr>
+        <w:t xml:space="preserve">Figure A.6 — 27 errors password.</w:t>
+      </w:r>
+    </w:p>
+    <w:bookmarkEnd w:id="190"/>
+    <w:bookmarkStart w:id="194" w:name="a.7-28-alter-role"/>
+    <w:p>
+      <w:pPr>
+        <w:pStyle w:val="Heading3"/>
+      </w:pPr>
+      <w:r>
+        <w:rPr>
+          <w:rStyle w:val="SectionNumber"/>
+        </w:rPr>
+        <w:t xml:space="preserve">1.9.7</w:t>
+      </w:r>
+      <w:r>
+        <w:tab/>
+      </w:r>
+      <w:r>
+        <w:t xml:space="preserve">A.7 — 28 alter role</w:t>
+      </w:r>
+    </w:p>
+    <w:p>
+      <w:pPr>
+        <w:pStyle w:val="CaptionedFigure"/>
+      </w:pPr>
+      <w:r>
+        <w:drawing>
+          <wp:inline>
+            <wp:extent cx="5334000" cy="4412973"/>
+            <wp:effectExtent b="0" l="0" r="0" t="0"/>
+            <wp:docPr descr="28 alter role" title="" id="192" name="Picture"/>
+            <a:graphic>
+              <a:graphicData uri="http://schemas.openxmlformats.org/drawingml/2006/picture">
+                <pic:pic>
+                  <pic:nvPicPr>
+                    <pic:cNvPr descr="/home/idrissa_yameogo/projets/ycognicore-cloud/docs/rapports/captures/10/28-alter-role.png" id="193" name="Picture"/>
+                    <pic:cNvPicPr>
+                      <a:picLocks noChangeArrowheads="1" noChangeAspect="1"/>
+                    </pic:cNvPicPr>
+                  </pic:nvPicPr>
+                  <pic:blipFill>
+                    <a:blip r:embed="rId191"/>
+                    <a:stretch>
+                      <a:fillRect/>
+                    </a:stretch>
+                  </pic:blipFill>
+                  <pic:spPr bwMode="auto">
+                    <a:xfrm>
+                      <a:off x="0" y="0"/>
+                      <a:ext cx="5334000" cy="4412973"/>
+                    </a:xfrm>
+                    <a:prstGeom prst="rect">
+                      <a:avLst/>
+                    </a:prstGeom>
+                    <a:noFill/>
+                    <a:ln w="9525">
+                      <a:noFill/>
+                      <a:headEnd/>
+                      <a:tailEnd/>
+                    </a:ln>
+                  </pic:spPr>
+                </pic:pic>
+              </a:graphicData>
+            </a:graphic>
+          </wp:inline>
+        </w:drawing>
+      </w:r>
+    </w:p>
+    <w:p>
+      <w:pPr>
+        <w:pStyle w:val="ImageCaption"/>
+      </w:pPr>
+      <w:r>
+        <w:t xml:space="preserve">28 alter role</w:t>
+      </w:r>
+    </w:p>
+    <w:p>
+      <w:pPr>
+        <w:pStyle w:val="BodyText"/>
+      </w:pPr>
+      <w:r>
+        <w:rPr>
+          <w:i/>
+          <w:iCs/>
+        </w:rPr>
+        <w:t xml:space="preserve">Figure A.7 — 28 alter role.</w:t>
+      </w:r>
+    </w:p>
+    <w:bookmarkEnd w:id="194"/>
+    <w:bookmarkStart w:id="198" w:name="a.8-29-tenant-databases"/>
+    <w:p>
+      <w:pPr>
+        <w:pStyle w:val="Heading3"/>
+      </w:pPr>
+      <w:r>
+        <w:rPr>
+          <w:rStyle w:val="SectionNumber"/>
+        </w:rPr>
+        <w:t xml:space="preserve">1.9.8</w:t>
+      </w:r>
+      <w:r>
+        <w:tab/>
+      </w:r>
+      <w:r>
+        <w:t xml:space="preserve">A.8 — 29 tenant databases</w:t>
+      </w:r>
+    </w:p>
+    <w:p>
+      <w:pPr>
+        <w:pStyle w:val="CaptionedFigure"/>
+      </w:pPr>
+      <w:r>
+        <w:drawing>
+          <wp:inline>
+            <wp:extent cx="5334000" cy="1520733"/>
+            <wp:effectExtent b="0" l="0" r="0" t="0"/>
+            <wp:docPr descr="29 tenant databases" title="" id="196" name="Picture"/>
+            <a:graphic>
+              <a:graphicData uri="http://schemas.openxmlformats.org/drawingml/2006/picture">
+                <pic:pic>
+                  <pic:nvPicPr>
+                    <pic:cNvPr descr="/home/idrissa_yameogo/projets/ycognicore-cloud/docs/rapports/captures/10/29-tenant-databases.png" id="197" name="Picture"/>
+                    <pic:cNvPicPr>
+                      <a:picLocks noChangeArrowheads="1" noChangeAspect="1"/>
+                    </pic:cNvPicPr>
+                  </pic:nvPicPr>
+                  <pic:blipFill>
+                    <a:blip r:embed="rId195"/>
+                    <a:stretch>
+                      <a:fillRect/>
+                    </a:stretch>
+                  </pic:blipFill>
+                  <pic:spPr bwMode="auto">
+                    <a:xfrm>
+                      <a:off x="0" y="0"/>
+                      <a:ext cx="5334000" cy="1520733"/>
+                    </a:xfrm>
+                    <a:prstGeom prst="rect">
+                      <a:avLst/>
+                    </a:prstGeom>
+                    <a:noFill/>
+                    <a:ln w="9525">
+                      <a:noFill/>
+                      <a:headEnd/>
+                      <a:tailEnd/>
+                    </a:ln>
+                  </pic:spPr>
+                </pic:pic>
+              </a:graphicData>
+            </a:graphic>
+          </wp:inline>
+        </w:drawing>
+      </w:r>
+    </w:p>
+    <w:p>
+      <w:pPr>
+        <w:pStyle w:val="ImageCaption"/>
+      </w:pPr>
+      <w:r>
+        <w:t xml:space="preserve">29 tenant databases</w:t>
+      </w:r>
+    </w:p>
+    <w:p>
+      <w:pPr>
+        <w:pStyle w:val="BodyText"/>
+      </w:pPr>
+      <w:r>
+        <w:rPr>
+          <w:i/>
+          <w:iCs/>
+        </w:rPr>
+        <w:t xml:space="preserve">Figure A.8 — 29 tenant databases.</w:t>
+      </w:r>
+    </w:p>
+    <w:bookmarkEnd w:id="198"/>
+    <w:bookmarkStart w:id="202" w:name="a.9-32-partitions-demo002"/>
+    <w:p>
+      <w:pPr>
+        <w:pStyle w:val="Heading3"/>
+      </w:pPr>
+      <w:r>
+        <w:rPr>
+          <w:rStyle w:val="SectionNumber"/>
+        </w:rPr>
+        <w:t xml:space="preserve">1.9.9</w:t>
+      </w:r>
+      <w:r>
+        <w:tab/>
+      </w:r>
+      <w:r>
+        <w:t xml:space="preserve">A.9 — 32 partitions demo002</w:t>
+      </w:r>
+    </w:p>
+    <w:p>
+      <w:pPr>
+        <w:pStyle w:val="CaptionedFigure"/>
+      </w:pPr>
+      <w:r>
+        <w:drawing>
+          <wp:inline>
+            <wp:extent cx="5334000" cy="820174"/>
+            <wp:effectExtent b="0" l="0" r="0" t="0"/>
+            <wp:docPr descr="32 partitions demo002" title="" id="200" name="Picture"/>
+            <a:graphic>
+              <a:graphicData uri="http://schemas.openxmlformats.org/drawingml/2006/picture">
+                <pic:pic>
+                  <pic:nvPicPr>
+                    <pic:cNvPr descr="/home/idrissa_yameogo/projets/ycognicore-cloud/docs/rapports/captures/10/32-partitions-demo002.png" id="201" name="Picture"/>
+                    <pic:cNvPicPr>
+                      <a:picLocks noChangeArrowheads="1" noChangeAspect="1"/>
+                    </pic:cNvPicPr>
+                  </pic:nvPicPr>
+                  <pic:blipFill>
+                    <a:blip r:embed="rId199"/>
+                    <a:stretch>
+                      <a:fillRect/>
+                    </a:stretch>
+                  </pic:blipFill>
+                  <pic:spPr bwMode="auto">
+                    <a:xfrm>
+                      <a:off x="0" y="0"/>
+                      <a:ext cx="5334000" cy="820174"/>
+                    </a:xfrm>
+                    <a:prstGeom prst="rect">
+                      <a:avLst/>
+                    </a:prstGeom>
+                    <a:noFill/>
+                    <a:ln w="9525">
+                      <a:noFill/>
+                      <a:headEnd/>
+                      <a:tailEnd/>
+                    </a:ln>
+                  </pic:spPr>
+                </pic:pic>
+              </a:graphicData>
+            </a:graphic>
+          </wp:inline>
+        </w:drawing>
+      </w:r>
+    </w:p>
+    <w:p>
+      <w:pPr>
+        <w:pStyle w:val="ImageCaption"/>
+      </w:pPr>
+      <w:r>
+        <w:t xml:space="preserve">32 partitions demo002</w:t>
+      </w:r>
+    </w:p>
+    <w:p>
+      <w:pPr>
+        <w:pStyle w:val="BodyText"/>
+      </w:pPr>
+      <w:r>
+        <w:rPr>
+          <w:i/>
+          <w:iCs/>
+        </w:rPr>
+        <w:t xml:space="preserve">Figure A.9 — 32 partitions demo002.</w:t>
+      </w:r>
+    </w:p>
+    <w:bookmarkEnd w:id="202"/>
+    <w:bookmarkStart w:id="206" w:name="a.10-36-ports"/>
+    <w:p>
+      <w:pPr>
+        <w:pStyle w:val="Heading3"/>
+      </w:pPr>
+      <w:r>
+        <w:rPr>
+          <w:rStyle w:val="SectionNumber"/>
+        </w:rPr>
+        <w:t xml:space="preserve">1.9.10</w:t>
+      </w:r>
+      <w:r>
+        <w:tab/>
+      </w:r>
+      <w:r>
+        <w:t xml:space="preserve">A.10 — 36 ports</w:t>
+      </w:r>
+    </w:p>
+    <w:p>
+      <w:pPr>
+        <w:pStyle w:val="CaptionedFigure"/>
+      </w:pPr>
+      <w:r>
+        <w:drawing>
+          <wp:inline>
+            <wp:extent cx="5334000" cy="2092708"/>
+            <wp:effectExtent b="0" l="0" r="0" t="0"/>
+            <wp:docPr descr="36 ports" title="" id="204" name="Picture"/>
+            <a:graphic>
+              <a:graphicData uri="http://schemas.openxmlformats.org/drawingml/2006/picture">
+                <pic:pic>
+                  <pic:nvPicPr>
+                    <pic:cNvPr descr="/home/idrissa_yameogo/projets/ycognicore-cloud/docs/rapports/captures/10/36-ports.png" id="205" name="Picture"/>
+                    <pic:cNvPicPr>
+                      <a:picLocks noChangeArrowheads="1" noChangeAspect="1"/>
+                    </pic:cNvPicPr>
+                  </pic:nvPicPr>
+                  <pic:blipFill>
+                    <a:blip r:embed="rId203"/>
+                    <a:stretch>
+                      <a:fillRect/>
+                    </a:stretch>
+                  </pic:blipFill>
+                  <pic:spPr bwMode="auto">
+                    <a:xfrm>
+                      <a:off x="0" y="0"/>
+                      <a:ext cx="5334000" cy="2092708"/>
+                    </a:xfrm>
+                    <a:prstGeom prst="rect">
+                      <a:avLst/>
+                    </a:prstGeom>
+                    <a:noFill/>
+                    <a:ln w="9525">
+                      <a:noFill/>
+                      <a:headEnd/>
+                      <a:tailEnd/>
+                    </a:ln>
+                  </pic:spPr>
+                </pic:pic>
+              </a:graphicData>
+            </a:graphic>
+          </wp:inline>
+        </w:drawing>
+      </w:r>
+    </w:p>
+    <w:p>
+      <w:pPr>
+        <w:pStyle w:val="ImageCaption"/>
+      </w:pPr>
+      <w:r>
+        <w:t xml:space="preserve">36 ports</w:t>
+      </w:r>
+    </w:p>
+    <w:p>
+      <w:pPr>
+        <w:pStyle w:val="BodyText"/>
+      </w:pPr>
+      <w:r>
+        <w:rPr>
+          <w:i/>
+          <w:iCs/>
+        </w:rPr>
+        <w:t xml:space="preserve">Figure A.10 — 36 ports.</w:t>
+      </w:r>
+    </w:p>
+    <w:bookmarkEnd w:id="206"/>
+    <w:bookmarkStart w:id="210" w:name="a.11-37-dumps"/>
+    <w:p>
+      <w:pPr>
+        <w:pStyle w:val="Heading3"/>
+      </w:pPr>
+      <w:r>
+        <w:rPr>
+          <w:rStyle w:val="SectionNumber"/>
+        </w:rPr>
+        <w:t xml:space="preserve">1.9.11</w:t>
+      </w:r>
+      <w:r>
+        <w:tab/>
+      </w:r>
+      <w:r>
+        <w:t xml:space="preserve">A.11 — 37 dumps</w:t>
+      </w:r>
+    </w:p>
+    <w:p>
+      <w:pPr>
+        <w:pStyle w:val="CaptionedFigure"/>
+      </w:pPr>
+      <w:r>
+        <w:drawing>
+          <wp:inline>
+            <wp:extent cx="5334000" cy="2069162"/>
+            <wp:effectExtent b="0" l="0" r="0" t="0"/>
+            <wp:docPr descr="37 dumps" title="" id="208" name="Picture"/>
+            <a:graphic>
+              <a:graphicData uri="http://schemas.openxmlformats.org/drawingml/2006/picture">
+                <pic:pic>
+                  <pic:nvPicPr>
+                    <pic:cNvPr descr="/home/idrissa_yameogo/projets/ycognicore-cloud/docs/rapports/captures/10/37-dumps.png" id="209" name="Picture"/>
+                    <pic:cNvPicPr>
+                      <a:picLocks noChangeArrowheads="1" noChangeAspect="1"/>
+                    </pic:cNvPicPr>
+                  </pic:nvPicPr>
+                  <pic:blipFill>
+                    <a:blip r:embed="rId207"/>
+                    <a:stretch>
+                      <a:fillRect/>
+                    </a:stretch>
+                  </pic:blipFill>
+                  <pic:spPr bwMode="auto">
+                    <a:xfrm>
+                      <a:off x="0" y="0"/>
+                      <a:ext cx="5334000" cy="2069162"/>
+                    </a:xfrm>
+                    <a:prstGeom prst="rect">
+                      <a:avLst/>
+                    </a:prstGeom>
+                    <a:noFill/>
+                    <a:ln w="9525">
+                      <a:noFill/>
+                      <a:headEnd/>
+                      <a:tailEnd/>
+                    </a:ln>
+                  </pic:spPr>
+                </pic:pic>
+              </a:graphicData>
+            </a:graphic>
+          </wp:inline>
+        </w:drawing>
+      </w:r>
+    </w:p>
+    <w:p>
+      <w:pPr>
+        <w:pStyle w:val="ImageCaption"/>
+      </w:pPr>
+      <w:r>
+        <w:t xml:space="preserve">37 dumps</w:t>
+      </w:r>
+    </w:p>
+    <w:p>
+      <w:pPr>
+        <w:pStyle w:val="BodyText"/>
+      </w:pPr>
+      <w:r>
+        <w:rPr>
+          <w:i/>
+          <w:iCs/>
+        </w:rPr>
+        <w:t xml:space="preserve">Figure A.11 — 37 dumps.</w:t>
+      </w:r>
+    </w:p>
+    <w:bookmarkEnd w:id="210"/>
+    <w:bookmarkStart w:id="214" w:name="a.12-39-images-modif"/>
+    <w:p>
+      <w:pPr>
+        <w:pStyle w:val="Heading3"/>
+      </w:pPr>
+      <w:r>
+        <w:rPr>
+          <w:rStyle w:val="SectionNumber"/>
+        </w:rPr>
+        <w:t xml:space="preserve">1.9.12</w:t>
+      </w:r>
+      <w:r>
+        <w:tab/>
+      </w:r>
+      <w:r>
+        <w:t xml:space="preserve">A.12 — 39 images modif</w:t>
+      </w:r>
+    </w:p>
+    <w:p>
+      <w:pPr>
+        <w:pStyle w:val="CaptionedFigure"/>
+      </w:pPr>
+      <w:r>
+        <w:drawing>
+          <wp:inline>
+            <wp:extent cx="5334000" cy="1371600"/>
+            <wp:effectExtent b="0" l="0" r="0" t="0"/>
+            <wp:docPr descr="39 images modif" title="" id="212" name="Picture"/>
+            <a:graphic>
+              <a:graphicData uri="http://schemas.openxmlformats.org/drawingml/2006/picture">
+                <pic:pic>
+                  <pic:nvPicPr>
+                    <pic:cNvPr descr="/home/idrissa_yameogo/projets/ycognicore-cloud/docs/rapports/captures/10/39-images-modif.png" id="213" name="Picture"/>
+                    <pic:cNvPicPr>
+                      <a:picLocks noChangeArrowheads="1" noChangeAspect="1"/>
+                    </pic:cNvPicPr>
+                  </pic:nvPicPr>
+                  <pic:blipFill>
+                    <a:blip r:embed="rId211"/>
+                    <a:stretch>
+                      <a:fillRect/>
+                    </a:stretch>
+                  </pic:blipFill>
+                  <pic:spPr bwMode="auto">
+                    <a:xfrm>
+                      <a:off x="0" y="0"/>
+                      <a:ext cx="5334000" cy="1371600"/>
+                    </a:xfrm>
+                    <a:prstGeom prst="rect">
+                      <a:avLst/>
+                    </a:prstGeom>
+                    <a:noFill/>
+                    <a:ln w="9525">
+                      <a:noFill/>
+                      <a:headEnd/>
+                      <a:tailEnd/>
+                    </a:ln>
+                  </pic:spPr>
+                </pic:pic>
+              </a:graphicData>
+            </a:graphic>
+          </wp:inline>
+        </w:drawing>
+      </w:r>
+    </w:p>
+    <w:p>
+      <w:pPr>
+        <w:pStyle w:val="ImageCaption"/>
+      </w:pPr>
+      <w:r>
+        <w:t xml:space="preserve">39 images modif</w:t>
+      </w:r>
+    </w:p>
+    <w:p>
+      <w:pPr>
+        <w:pStyle w:val="BodyText"/>
+      </w:pPr>
+      <w:r>
+        <w:rPr>
+          <w:i/>
+          <w:iCs/>
+        </w:rPr>
+        <w:t xml:space="preserve">Figure A.12 — 39 images modif.</w:t>
+      </w:r>
+    </w:p>
+    <w:bookmarkEnd w:id="214"/>
+    <w:bookmarkStart w:id="218" w:name="a.13-40-test-pull"/>
+    <w:p>
+      <w:pPr>
+        <w:pStyle w:val="Heading3"/>
+      </w:pPr>
+      <w:r>
+        <w:rPr>
+          <w:rStyle w:val="SectionNumber"/>
+        </w:rPr>
+        <w:t xml:space="preserve">1.9.13</w:t>
+      </w:r>
+      <w:r>
+        <w:tab/>
+      </w:r>
+      <w:r>
+        <w:t xml:space="preserve">A.13 — 40 test pull</w:t>
+      </w:r>
+    </w:p>
+    <w:p>
+      <w:pPr>
+        <w:pStyle w:val="CaptionedFigure"/>
+      </w:pPr>
+      <w:r>
+        <w:drawing>
+          <wp:inline>
+            <wp:extent cx="5334000" cy="2582524"/>
+            <wp:effectExtent b="0" l="0" r="0" t="0"/>
+            <wp:docPr descr="40 test pull" title="" id="216" name="Picture"/>
+            <a:graphic>
+              <a:graphicData uri="http://schemas.openxmlformats.org/drawingml/2006/picture">
+                <pic:pic>
+                  <pic:nvPicPr>
+                    <pic:cNvPr descr="/home/idrissa_yameogo/projets/ycognicore-cloud/docs/rapports/captures/10/40-test-pull.png" id="217" name="Picture"/>
+                    <pic:cNvPicPr>
+                      <a:picLocks noChangeArrowheads="1" noChangeAspect="1"/>
+                    </pic:cNvPicPr>
+                  </pic:nvPicPr>
+                  <pic:blipFill>
+                    <a:blip r:embed="rId215"/>
+                    <a:stretch>
+                      <a:fillRect/>
+                    </a:stretch>
+                  </pic:blipFill>
+                  <pic:spPr bwMode="auto">
+                    <a:xfrm>
+                      <a:off x="0" y="0"/>
+                      <a:ext cx="5334000" cy="2582524"/>
+                    </a:xfrm>
+                    <a:prstGeom prst="rect">
+                      <a:avLst/>
+                    </a:prstGeom>
+                    <a:noFill/>
+                    <a:ln w="9525">
+                      <a:noFill/>
+                      <a:headEnd/>
+                      <a:tailEnd/>
+                    </a:ln>
+                  </pic:spPr>
+                </pic:pic>
+              </a:graphicData>
+            </a:graphic>
+          </wp:inline>
+        </w:drawing>
+      </w:r>
+    </w:p>
+    <w:p>
+      <w:pPr>
+        <w:pStyle w:val="ImageCaption"/>
+      </w:pPr>
+      <w:r>
+        <w:t xml:space="preserve">40 test pull</w:t>
+      </w:r>
+    </w:p>
+    <w:p>
+      <w:pPr>
+        <w:pStyle w:val="BodyText"/>
+      </w:pPr>
+      <w:r>
+        <w:rPr>
+          <w:i/>
+          <w:iCs/>
+        </w:rPr>
+        <w:t xml:space="preserve">Figure A.13 — 40 test pull.</w:t>
+      </w:r>
+    </w:p>
+    <w:bookmarkEnd w:id="218"/>
+    <w:bookmarkStart w:id="222" w:name="a.14-42-healthcheck"/>
+    <w:p>
+      <w:pPr>
+        <w:pStyle w:val="Heading3"/>
+      </w:pPr>
+      <w:r>
+        <w:rPr>
+          <w:rStyle w:val="SectionNumber"/>
+        </w:rPr>
+        <w:t xml:space="preserve">1.9.14</w:t>
+      </w:r>
+      <w:r>
+        <w:tab/>
+      </w:r>
+      <w:r>
+        <w:t xml:space="preserve">A.14 — 42 healthcheck</w:t>
+      </w:r>
+    </w:p>
+    <w:p>
+      <w:pPr>
+        <w:pStyle w:val="CaptionedFigure"/>
+      </w:pPr>
+      <w:r>
+        <w:drawing>
+          <wp:inline>
+            <wp:extent cx="5334000" cy="3169290"/>
+            <wp:effectExtent b="0" l="0" r="0" t="0"/>
+            <wp:docPr descr="42 healthcheck" title="" id="220" name="Picture"/>
+            <a:graphic>
+              <a:graphicData uri="http://schemas.openxmlformats.org/drawingml/2006/picture">
+                <pic:pic>
+                  <pic:nvPicPr>
+                    <pic:cNvPr descr="/home/idrissa_yameogo/projets/ycognicore-cloud/docs/rapports/captures/10/42-healthcheck.png" id="221" name="Picture"/>
+                    <pic:cNvPicPr>
+                      <a:picLocks noChangeArrowheads="1" noChangeAspect="1"/>
+                    </pic:cNvPicPr>
+                  </pic:nvPicPr>
+                  <pic:blipFill>
+                    <a:blip r:embed="rId219"/>
+                    <a:stretch>
+                      <a:fillRect/>
+                    </a:stretch>
+                  </pic:blipFill>
+                  <pic:spPr bwMode="auto">
+                    <a:xfrm>
+                      <a:off x="0" y="0"/>
+                      <a:ext cx="5334000" cy="3169290"/>
+                    </a:xfrm>
+                    <a:prstGeom prst="rect">
+                      <a:avLst/>
+                    </a:prstGeom>
+                    <a:noFill/>
+                    <a:ln w="9525">
+                      <a:noFill/>
+                      <a:headEnd/>
+                      <a:tailEnd/>
+                    </a:ln>
+                  </pic:spPr>
+                </pic:pic>
+              </a:graphicData>
+            </a:graphic>
+          </wp:inline>
+        </w:drawing>
+      </w:r>
+    </w:p>
+    <w:p>
+      <w:pPr>
+        <w:pStyle w:val="ImageCaption"/>
+      </w:pPr>
+      <w:r>
+        <w:t xml:space="preserve">42 healthcheck</w:t>
+      </w:r>
+    </w:p>
+    <w:p>
+      <w:pPr>
+        <w:pStyle w:val="BodyText"/>
+      </w:pPr>
+      <w:r>
+        <w:rPr>
+          <w:i/>
+          <w:iCs/>
+        </w:rPr>
+        <w:t xml:space="preserve">Figure A.14 — 42 healthcheck.</w:t>
+      </w:r>
+    </w:p>
+    <w:bookmarkEnd w:id="222"/>
+    <w:bookmarkStart w:id="226" w:name="a.15-43-vault-healthy"/>
+    <w:p>
+      <w:pPr>
+        <w:pStyle w:val="Heading3"/>
+      </w:pPr>
+      <w:r>
+        <w:rPr>
+          <w:rStyle w:val="SectionNumber"/>
+        </w:rPr>
+        <w:t xml:space="preserve">1.9.15</w:t>
+      </w:r>
+      <w:r>
+        <w:tab/>
+      </w:r>
+      <w:r>
+        <w:t xml:space="preserve">A.15 — 43 vault healthy</w:t>
+      </w:r>
+    </w:p>
+    <w:p>
+      <w:pPr>
+        <w:pStyle w:val="CaptionedFigure"/>
+      </w:pPr>
+      <w:r>
+        <w:drawing>
+          <wp:inline>
+            <wp:extent cx="5334000" cy="3209279"/>
+            <wp:effectExtent b="0" l="0" r="0" t="0"/>
+            <wp:docPr descr="43 vault healthy" title="" id="224" name="Picture"/>
+            <a:graphic>
+              <a:graphicData uri="http://schemas.openxmlformats.org/drawingml/2006/picture">
+                <pic:pic>
+                  <pic:nvPicPr>
+                    <pic:cNvPr descr="/home/idrissa_yameogo/projets/ycognicore-cloud/docs/rapports/captures/10/43-vault-healthy.png" id="225" name="Picture"/>
+                    <pic:cNvPicPr>
+                      <a:picLocks noChangeArrowheads="1" noChangeAspect="1"/>
+                    </pic:cNvPicPr>
+                  </pic:nvPicPr>
+                  <pic:blipFill>
+                    <a:blip r:embed="rId223"/>
+                    <a:stretch>
+                      <a:fillRect/>
+                    </a:stretch>
+                  </pic:blipFill>
+                  <pic:spPr bwMode="auto">
+                    <a:xfrm>
+                      <a:off x="0" y="0"/>
+                      <a:ext cx="5334000" cy="3209279"/>
+                    </a:xfrm>
+                    <a:prstGeom prst="rect">
+                      <a:avLst/>
+                    </a:prstGeom>
+                    <a:noFill/>
+                    <a:ln w="9525">
+                      <a:noFill/>
+                      <a:headEnd/>
+                      <a:tailEnd/>
+                    </a:ln>
+                  </pic:spPr>
+                </pic:pic>
+              </a:graphicData>
+            </a:graphic>
+          </wp:inline>
+        </w:drawing>
+      </w:r>
+    </w:p>
+    <w:p>
+      <w:pPr>
+        <w:pStyle w:val="ImageCaption"/>
+      </w:pPr>
+      <w:r>
+        <w:t xml:space="preserve">43 vault healthy</w:t>
+      </w:r>
+    </w:p>
+    <w:p>
+      <w:pPr>
+        <w:pStyle w:val="BodyText"/>
+      </w:pPr>
+      <w:r>
+        <w:rPr>
+          <w:i/>
+          <w:iCs/>
+        </w:rPr>
+        <w:t xml:space="preserve">Figure A.15 — 43 vault healthy.</w:t>
+      </w:r>
+    </w:p>
+    <w:bookmarkEnd w:id="226"/>
+    <w:bookmarkStart w:id="230" w:name="a.16-44-verif-pg"/>
+    <w:p>
+      <w:pPr>
+        <w:pStyle w:val="Heading3"/>
+      </w:pPr>
+      <w:r>
+        <w:rPr>
+          <w:rStyle w:val="SectionNumber"/>
+        </w:rPr>
+        <w:t xml:space="preserve">1.9.16</w:t>
+      </w:r>
+      <w:r>
+        <w:tab/>
+      </w:r>
+      <w:r>
+        <w:t xml:space="preserve">A.16 — 44 verif pg</w:t>
+      </w:r>
+    </w:p>
+    <w:p>
+      <w:pPr>
+        <w:pStyle w:val="CaptionedFigure"/>
+      </w:pPr>
+      <w:r>
+        <w:drawing>
+          <wp:inline>
+            <wp:extent cx="5334000" cy="4380902"/>
+            <wp:effectExtent b="0" l="0" r="0" t="0"/>
+            <wp:docPr descr="44 verif pg" title="" id="228" name="Picture"/>
+            <a:graphic>
+              <a:graphicData uri="http://schemas.openxmlformats.org/drawingml/2006/picture">
+                <pic:pic>
+                  <pic:nvPicPr>
+                    <pic:cNvPr descr="/home/idrissa_yameogo/projets/ycognicore-cloud/docs/rapports/captures/10/44-verif-pg.png" id="229" name="Picture"/>
+                    <pic:cNvPicPr>
+                      <a:picLocks noChangeArrowheads="1" noChangeAspect="1"/>
+                    </pic:cNvPicPr>
+                  </pic:nvPicPr>
+                  <pic:blipFill>
+                    <a:blip r:embed="rId227"/>
+                    <a:stretch>
+                      <a:fillRect/>
+                    </a:stretch>
+                  </pic:blipFill>
+                  <pic:spPr bwMode="auto">
+                    <a:xfrm>
+                      <a:off x="0" y="0"/>
+                      <a:ext cx="5334000" cy="4380902"/>
+                    </a:xfrm>
+                    <a:prstGeom prst="rect">
+                      <a:avLst/>
+                    </a:prstGeom>
+                    <a:noFill/>
+                    <a:ln w="9525">
+                      <a:noFill/>
+                      <a:headEnd/>
+                      <a:tailEnd/>
+                    </a:ln>
+                  </pic:spPr>
+                </pic:pic>
+              </a:graphicData>
+            </a:graphic>
+          </wp:inline>
+        </w:drawing>
+      </w:r>
+    </w:p>
+    <w:p>
+      <w:pPr>
+        <w:pStyle w:val="ImageCaption"/>
+      </w:pPr>
+      <w:r>
+        <w:t xml:space="preserve">44 verif pg</w:t>
+      </w:r>
+    </w:p>
+    <w:p>
+      <w:pPr>
+        <w:pStyle w:val="BodyText"/>
+      </w:pPr>
+      <w:r>
+        <w:rPr>
+          <w:i/>
+          <w:iCs/>
+        </w:rPr>
+        <w:t xml:space="preserve">Figure A.16 — 44 verif pg.</w:t>
+      </w:r>
+    </w:p>
+    <w:bookmarkEnd w:id="230"/>
+    <w:bookmarkStart w:id="234" w:name="a.17-45-tests-services"/>
+    <w:p>
+      <w:pPr>
+        <w:pStyle w:val="Heading3"/>
+      </w:pPr>
+      <w:r>
+        <w:rPr>
+          <w:rStyle w:val="SectionNumber"/>
+        </w:rPr>
+        <w:t xml:space="preserve">1.9.17</w:t>
+      </w:r>
+      <w:r>
+        <w:tab/>
+      </w:r>
+      <w:r>
+        <w:t xml:space="preserve">A.17 — 45 tests services</w:t>
+      </w:r>
+    </w:p>
+    <w:p>
+      <w:pPr>
+        <w:pStyle w:val="CaptionedFigure"/>
+      </w:pPr>
+      <w:r>
+        <w:drawing>
+          <wp:inline>
+            <wp:extent cx="5334000" cy="4261433"/>
+            <wp:effectExtent b="0" l="0" r="0" t="0"/>
+            <wp:docPr descr="45 tests services" title="" id="232" name="Picture"/>
+            <a:graphic>
+              <a:graphicData uri="http://schemas.openxmlformats.org/drawingml/2006/picture">
+                <pic:pic>
+                  <pic:nvPicPr>
+                    <pic:cNvPr descr="/home/idrissa_yameogo/projets/ycognicore-cloud/docs/rapports/captures/10/45-tests-services.png" id="233" name="Picture"/>
+                    <pic:cNvPicPr>
+                      <a:picLocks noChangeArrowheads="1" noChangeAspect="1"/>
+                    </pic:cNvPicPr>
+                  </pic:nvPicPr>
+                  <pic:blipFill>
+                    <a:blip r:embed="rId231"/>
+                    <a:stretch>
+                      <a:fillRect/>
+                    </a:stretch>
+                  </pic:blipFill>
+                  <pic:spPr bwMode="auto">
+                    <a:xfrm>
+                      <a:off x="0" y="0"/>
+                      <a:ext cx="5334000" cy="4261433"/>
+                    </a:xfrm>
+                    <a:prstGeom prst="rect">
+                      <a:avLst/>
+                    </a:prstGeom>
+                    <a:noFill/>
+                    <a:ln w="9525">
+                      <a:noFill/>
+                      <a:headEnd/>
+                      <a:tailEnd/>
+                    </a:ln>
+                  </pic:spPr>
+                </pic:pic>
+              </a:graphicData>
+            </a:graphic>
+          </wp:inline>
+        </w:drawing>
+      </w:r>
+    </w:p>
+    <w:p>
+      <w:pPr>
+        <w:pStyle w:val="ImageCaption"/>
+      </w:pPr>
+      <w:r>
+        <w:t xml:space="preserve">45 tests services</w:t>
+      </w:r>
+    </w:p>
+    <w:p>
+      <w:pPr>
+        <w:pStyle w:val="BodyText"/>
+      </w:pPr>
+      <w:r>
+        <w:rPr>
+          <w:i/>
+          <w:iCs/>
+        </w:rPr>
+        <w:t xml:space="preserve">Figure A.17 — 45 tests services.</w:t>
+      </w:r>
+    </w:p>
+    <w:bookmarkEnd w:id="234"/>
+    <w:bookmarkStart w:id="238" w:name="a.18-46-init-vault-ok"/>
+    <w:p>
+      <w:pPr>
+        <w:pStyle w:val="Heading3"/>
+      </w:pPr>
+      <w:r>
+        <w:rPr>
+          <w:rStyle w:val="SectionNumber"/>
+        </w:rPr>
+        <w:t xml:space="preserve">1.9.18</w:t>
+      </w:r>
+      <w:r>
+        <w:tab/>
+      </w:r>
+      <w:r>
+        <w:t xml:space="preserve">A.18 — 46 init vault ok</w:t>
+      </w:r>
+    </w:p>
+    <w:p>
+      <w:pPr>
+        <w:pStyle w:val="CaptionedFigure"/>
+      </w:pPr>
+      <w:r>
+        <w:drawing>
+          <wp:inline>
+            <wp:extent cx="5334000" cy="917448"/>
+            <wp:effectExtent b="0" l="0" r="0" t="0"/>
+            <wp:docPr descr="46 init vault ok" title="" id="236" name="Picture"/>
+            <a:graphic>
+              <a:graphicData uri="http://schemas.openxmlformats.org/drawingml/2006/picture">
+                <pic:pic>
+                  <pic:nvPicPr>
+                    <pic:cNvPr descr="/home/idrissa_yameogo/projets/ycognicore-cloud/docs/rapports/captures/10/46-init-vault-ok.png" id="237" name="Picture"/>
+                    <pic:cNvPicPr>
+                      <a:picLocks noChangeArrowheads="1" noChangeAspect="1"/>
+                    </pic:cNvPicPr>
+                  </pic:nvPicPr>
+                  <pic:blipFill>
+                    <a:blip r:embed="rId235"/>
+                    <a:stretch>
+                      <a:fillRect/>
+                    </a:stretch>
+                  </pic:blipFill>
+                  <pic:spPr bwMode="auto">
+                    <a:xfrm>
+                      <a:off x="0" y="0"/>
+                      <a:ext cx="5334000" cy="917448"/>
+                    </a:xfrm>
+                    <a:prstGeom prst="rect">
+                      <a:avLst/>
+                    </a:prstGeom>
+                    <a:noFill/>
+                    <a:ln w="9525">
+                      <a:noFill/>
+                      <a:headEnd/>
+                      <a:tailEnd/>
+                    </a:ln>
+                  </pic:spPr>
+                </pic:pic>
+              </a:graphicData>
+            </a:graphic>
+          </wp:inline>
+        </w:drawing>
+      </w:r>
+    </w:p>
+    <w:p>
+      <w:pPr>
+        <w:pStyle w:val="ImageCaption"/>
+      </w:pPr>
+      <w:r>
+        <w:t xml:space="preserve">46 init vault ok</w:t>
+      </w:r>
+    </w:p>
+    <w:p>
+      <w:pPr>
+        <w:pStyle w:val="BodyText"/>
+      </w:pPr>
+      <w:r>
+        <w:rPr>
+          <w:i/>
+          <w:iCs/>
+        </w:rPr>
+        <w:t xml:space="preserve">Figure A.18 — 46 init vault ok.</w:t>
+      </w:r>
+    </w:p>
+    <w:bookmarkEnd w:id="238"/>
+    <w:bookmarkStart w:id="242" w:name="a.19-47-init-minio-ok"/>
+    <w:p>
+      <w:pPr>
+        <w:pStyle w:val="Heading3"/>
+      </w:pPr>
+      <w:r>
+        <w:rPr>
+          <w:rStyle w:val="SectionNumber"/>
+        </w:rPr>
+        <w:t xml:space="preserve">1.9.19</w:t>
+      </w:r>
+      <w:r>
+        <w:tab/>
+      </w:r>
+      <w:r>
+        <w:t xml:space="preserve">A.19 — 47 init minio ok</w:t>
+      </w:r>
+    </w:p>
+    <w:p>
+      <w:pPr>
+        <w:pStyle w:val="CaptionedFigure"/>
+      </w:pPr>
+      <w:r>
+        <w:drawing>
+          <wp:inline>
+            <wp:extent cx="5334000" cy="4318555"/>
+            <wp:effectExtent b="0" l="0" r="0" t="0"/>
+            <wp:docPr descr="47 init minio ok" title="" id="240" name="Picture"/>
+            <a:graphic>
+              <a:graphicData uri="http://schemas.openxmlformats.org/drawingml/2006/picture">
+                <pic:pic>
+                  <pic:nvPicPr>
+                    <pic:cNvPr descr="/home/idrissa_yameogo/projets/ycognicore-cloud/docs/rapports/captures/10/47-init-minio-ok.png" id="241" name="Picture"/>
+                    <pic:cNvPicPr>
+                      <a:picLocks noChangeArrowheads="1" noChangeAspect="1"/>
+                    </pic:cNvPicPr>
+                  </pic:nvPicPr>
+                  <pic:blipFill>
+                    <a:blip r:embed="rId239"/>
+                    <a:stretch>
+                      <a:fillRect/>
+                    </a:stretch>
+                  </pic:blipFill>
+                  <pic:spPr bwMode="auto">
+                    <a:xfrm>
+                      <a:off x="0" y="0"/>
+                      <a:ext cx="5334000" cy="4318555"/>
+                    </a:xfrm>
+                    <a:prstGeom prst="rect">
+                      <a:avLst/>
+                    </a:prstGeom>
+                    <a:noFill/>
+                    <a:ln w="9525">
+                      <a:noFill/>
+                      <a:headEnd/>
+                      <a:tailEnd/>
+                    </a:ln>
+                  </pic:spPr>
+                </pic:pic>
+              </a:graphicData>
+            </a:graphic>
+          </wp:inline>
+        </w:drawing>
+      </w:r>
+    </w:p>
+    <w:p>
+      <w:pPr>
+        <w:pStyle w:val="ImageCaption"/>
+      </w:pPr>
+      <w:r>
+        <w:t xml:space="preserve">47 init minio ok</w:t>
+      </w:r>
+    </w:p>
+    <w:p>
+      <w:pPr>
+        <w:pStyle w:val="BodyText"/>
+      </w:pPr>
+      <w:r>
+        <w:rPr>
+          <w:i/>
+          <w:iCs/>
+        </w:rPr>
+        <w:t xml:space="preserve">Figure A.19 — 47 init minio ok.</w:t>
+      </w:r>
+    </w:p>
+    <w:bookmarkEnd w:id="242"/>
+    <w:bookmarkEnd w:id="243"/>
+    <w:bookmarkStart w:id="248" w:name="bilan-et-prochaines-étapes"/>
+    <w:p>
+      <w:pPr>
+        <w:pStyle w:val="Heading2"/>
+      </w:pPr>
+      <w:r>
+        <w:rPr>
+          <w:rStyle w:val="SectionNumber"/>
+        </w:rPr>
+        <w:t xml:space="preserve">1.10</w:t>
+      </w:r>
+      <w:r>
+        <w:tab/>
+      </w:r>
+      <w:r>
         <w:t xml:space="preserve">7. Bilan et prochaines étapes</w:t>
       </w:r>
     </w:p>
-    <w:bookmarkStart w:id="164" w:name="sprint-h0-clôturé-66"/>
+    <w:bookmarkStart w:id="244" w:name="sprint-h0-clôturé-66"/>
     <w:p>
       <w:pPr>
         <w:pStyle w:val="Heading3"/>
@@ -8287,7 +10026,7 @@
         <w:rPr>
           <w:rStyle w:val="SectionNumber"/>
         </w:rPr>
-        <w:t xml:space="preserve">1.9.1</w:t>
+        <w:t xml:space="preserve">1.10.1</w:t>
       </w:r>
       <w:r>
         <w:tab/>
@@ -8556,8 +10295,8 @@
         </w:tc>
       </w:tr>
     </w:tbl>
-    <w:bookmarkEnd w:id="164"/>
-    <w:bookmarkStart w:id="165" w:name="avancement-global-phase-1"/>
+    <w:bookmarkEnd w:id="244"/>
+    <w:bookmarkStart w:id="245" w:name="avancement-global-phase-1"/>
     <w:p>
       <w:pPr>
         <w:pStyle w:val="Heading3"/>
@@ -8566,7 +10305,7 @@
         <w:rPr>
           <w:rStyle w:val="SectionNumber"/>
         </w:rPr>
-        <w:t xml:space="preserve">1.9.2</w:t>
+        <w:t xml:space="preserve">1.10.2</w:t>
       </w:r>
       <w:r>
         <w:tab/>
@@ -8828,8 +10567,8 @@
         </w:tc>
       </w:tr>
     </w:tbl>
-    <w:bookmarkEnd w:id="165"/>
-    <w:bookmarkStart w:id="166" w:name="reste-à-faire"/>
+    <w:bookmarkEnd w:id="245"/>
+    <w:bookmarkStart w:id="246" w:name="reste-à-faire"/>
     <w:p>
       <w:pPr>
         <w:pStyle w:val="Heading3"/>
@@ -8838,7 +10577,7 @@
         <w:rPr>
           <w:rStyle w:val="SectionNumber"/>
         </w:rPr>
-        <w:t xml:space="preserve">1.9.3</w:t>
+        <w:t xml:space="preserve">1.10.3</w:t>
       </w:r>
       <w:r>
         <w:tab/>
@@ -9189,8 +10928,8 @@
         </w:tc>
       </w:tr>
     </w:tbl>
-    <w:bookmarkEnd w:id="166"/>
-    <w:bookmarkStart w:id="167" w:name="conformité-aux-directives-du-29092026"/>
+    <w:bookmarkEnd w:id="246"/>
+    <w:bookmarkStart w:id="247" w:name="conformité-aux-directives-du-29092026"/>
     <w:p>
       <w:pPr>
         <w:pStyle w:val="Heading3"/>
@@ -9199,7 +10938,7 @@
         <w:rPr>
           <w:rStyle w:val="SectionNumber"/>
         </w:rPr>
-        <w:t xml:space="preserve">1.9.4</w:t>
+        <w:t xml:space="preserve">1.10.4</w:t>
       </w:r>
       <w:r>
         <w:tab/>
@@ -9507,8 +11246,8 @@
         <w:t xml:space="preserve">Sprint H0 clôturé (6/6), Phase 1 à ~82 %</w:t>
       </w:r>
     </w:p>
-    <w:bookmarkEnd w:id="167"/>
-    <w:bookmarkEnd w:id="168"/>
+    <w:bookmarkEnd w:id="247"/>
+    <w:bookmarkEnd w:id="248"/>
     <w:sectPr>
       <w:footnotePr>
         <w:numRestart w:val="eachSect"/>

</xml_diff>